<commit_message>
Update features document to v3.0 with all 150+ features
</commit_message>
<xml_diff>
--- a/AutoApply-AI-Features.docx
+++ b/AutoApply-AI-Features.docx
@@ -160,7 +160,7 @@
                 <w:sz w:val="36"/>
                 <w:szCs w:val="36"/>
               </w:rPr>
-              <w:t xml:space="preserve">46</w:t>
+              <w:t xml:space="preserve">50</w:t>
             </w:r>
           </w:p>
           <w:p>
@@ -208,7 +208,7 @@
                 <w:sz w:val="36"/>
                 <w:szCs w:val="36"/>
               </w:rPr>
-              <w:t xml:space="preserve">15</w:t>
+              <w:t xml:space="preserve">16</w:t>
             </w:r>
           </w:p>
           <w:p>
@@ -281,7 +281,7 @@
                 <w:sz w:val="36"/>
                 <w:szCs w:val="36"/>
               </w:rPr>
-              <w:t xml:space="preserve">15</w:t>
+              <w:t xml:space="preserve">16</w:t>
             </w:r>
           </w:p>
           <w:p>
@@ -329,7 +329,7 @@
                 <w:sz w:val="36"/>
                 <w:szCs w:val="36"/>
               </w:rPr>
-              <w:t xml:space="preserve">29</w:t>
+              <w:t xml:space="preserve">34</w:t>
             </w:r>
           </w:p>
           <w:p>
@@ -377,7 +377,7 @@
                 <w:sz w:val="36"/>
                 <w:szCs w:val="36"/>
               </w:rPr>
-              <w:t xml:space="preserve">140+</w:t>
+              <w:t xml:space="preserve">150+</w:t>
             </w:r>
           </w:p>
           <w:p>
@@ -424,7 +424,7 @@
           <w:sz w:val="20"/>
           <w:szCs w:val="20"/>
         </w:rPr>
-        <w:t xml:space="preserve">April 2026</w:t>
+        <w:t xml:space="preserve">April 2026 — v3.0</w:t>
       </w:r>
     </w:p>
     <w:p>
@@ -465,13 +465,8 @@
           <w:sz w:val="22"/>
           <w:szCs w:val="22"/>
         </w:rPr>
-        <w:t xml:space="preserve">AutoApply AI is the world’s most feature-complete AI-powered job application platform, combining resume building, job tracking, interview preparation, salary negotiation, and automated applications into a single platform. Built for the Russian and Armenian job markets (hh.ru, staff.am) with global applicability.</w:t>
+        <w:t xml:space="preserve">AutoApply AI is the world’s most feature-complete AI-powered job application platform with 33 dashboard pages, 50 API endpoints, and 16 AI functions. It combines resume building, job tracking, AI interview preparation, salary negotiation, automated applications, team management, and advanced analytics into a single platform. Built for the Russian and Armenian job markets (hh.ru, staff.am) with global applicability.</w:t>
       </w:r>
-    </w:p>
-    <w:p>
-      <w:pPr>
-        <w:spacing w:after="200" w:before="200"/>
-      </w:pPr>
     </w:p>
     <w:p>
       <w:pPr>
@@ -655,7 +650,7 @@
                 <w:sz w:val="21"/>
                 <w:szCs w:val="21"/>
               </w:rPr>
-              <w:t xml:space="preserve">46 server-side API routes with authentication and rate limiting</w:t>
+              <w:t xml:space="preserve">50 server-side API routes with authentication</w:t>
             </w:r>
           </w:p>
         </w:tc>
@@ -715,7 +710,7 @@
                 <w:sz w:val="21"/>
                 <w:szCs w:val="21"/>
               </w:rPr>
-              <w:t xml:space="preserve">15 Groq LLM-powered functions for content generation and analysis</w:t>
+              <w:t xml:space="preserve">16 Groq LLM-powered functions (Llama 3.3 70B)</w:t>
             </w:r>
           </w:p>
         </w:tc>
@@ -775,7 +770,67 @@
                 <w:sz w:val="21"/>
                 <w:szCs w:val="21"/>
               </w:rPr>
-              <w:t xml:space="preserve">15 PostgreSQL tables with Row Level Security (Supabase)</w:t>
+              <w:t xml:space="preserve">16 PostgreSQL tables with Row Level Security</w:t>
+            </w:r>
+          </w:p>
+        </w:tc>
+      </w:tr>
+      <w:tr>
+        <w:tc>
+          <w:tcPr>
+            <w:tcW w:type="dxa" w:w="3200"/>
+            <w:tcBorders>
+              <w:top w:val="single" w:color="E2E8F0" w:sz="1"/>
+              <w:left w:val="single" w:color="E2E8F0" w:sz="1"/>
+              <w:bottom w:val="single" w:color="E2E8F0" w:sz="1"/>
+              <w:right w:val="single" w:color="E2E8F0" w:sz="1"/>
+            </w:tcBorders>
+            <w:tcMar>
+              <w:top w:type="dxa" w:w="60"/>
+              <w:left w:type="dxa" w:w="100"/>
+              <w:bottom w:type="dxa" w:w="60"/>
+              <w:right w:type="dxa" w:w="100"/>
+            </w:tcMar>
+          </w:tcPr>
+          <w:p>
+            <w:r>
+              <w:rPr>
+                <w:rFonts w:ascii="Arial" w:cs="Arial" w:eastAsia="Arial" w:hAnsi="Arial"/>
+                <w:b/>
+                <w:bCs/>
+                <w:color w:val="1E293B"/>
+                <w:sz w:val="21"/>
+                <w:szCs w:val="21"/>
+              </w:rPr>
+              <w:t xml:space="preserve">Public Pages</w:t>
+            </w:r>
+          </w:p>
+        </w:tc>
+        <w:tc>
+          <w:tcPr>
+            <w:tcW w:type="dxa" w:w="6160"/>
+            <w:tcBorders>
+              <w:top w:val="single" w:color="E2E8F0" w:sz="1"/>
+              <w:left w:val="single" w:color="E2E8F0" w:sz="1"/>
+              <w:bottom w:val="single" w:color="E2E8F0" w:sz="1"/>
+              <w:right w:val="single" w:color="E2E8F0" w:sz="1"/>
+            </w:tcBorders>
+            <w:tcMar>
+              <w:top w:type="dxa" w:w="60"/>
+              <w:left w:type="dxa" w:w="100"/>
+              <w:bottom w:type="dxa" w:w="60"/>
+              <w:right w:type="dxa" w:w="100"/>
+            </w:tcMar>
+          </w:tcPr>
+          <w:p>
+            <w:r>
+              <w:rPr>
+                <w:rFonts w:ascii="Arial" w:cs="Arial" w:eastAsia="Arial" w:hAnsi="Arial"/>
+                <w:color w:val="64748B"/>
+                <w:sz w:val="21"/>
+                <w:szCs w:val="21"/>
+              </w:rPr>
+              <w:t xml:space="preserve">12 SEO-optimized pages (pricing, blog, comparisons, resources)</w:t>
             </w:r>
           </w:p>
         </w:tc>
@@ -835,7 +890,7 @@
                 <w:sz w:val="21"/>
                 <w:szCs w:val="21"/>
               </w:rPr>
-              <w:t xml:space="preserve">v2.0 with inline Save/Quick Apply buttons on job pages</w:t>
+              <w:t xml:space="preserve">v2.0 with inline Save/Quick Apply on job pages</w:t>
             </w:r>
           </w:p>
         </w:tc>
@@ -896,6 +951,66 @@
                 <w:szCs w:val="21"/>
               </w:rPr>
               <w:t xml:space="preserve">English, Russian, Armenian support</w:t>
+            </w:r>
+          </w:p>
+        </w:tc>
+      </w:tr>
+      <w:tr>
+        <w:tc>
+          <w:tcPr>
+            <w:tcW w:type="dxa" w:w="3200"/>
+            <w:tcBorders>
+              <w:top w:val="single" w:color="E2E8F0" w:sz="1"/>
+              <w:left w:val="single" w:color="E2E8F0" w:sz="1"/>
+              <w:bottom w:val="single" w:color="E2E8F0" w:sz="1"/>
+              <w:right w:val="single" w:color="E2E8F0" w:sz="1"/>
+            </w:tcBorders>
+            <w:tcMar>
+              <w:top w:type="dxa" w:w="60"/>
+              <w:left w:type="dxa" w:w="100"/>
+              <w:bottom w:type="dxa" w:w="60"/>
+              <w:right w:type="dxa" w:w="100"/>
+            </w:tcMar>
+          </w:tcPr>
+          <w:p>
+            <w:r>
+              <w:rPr>
+                <w:rFonts w:ascii="Arial" w:cs="Arial" w:eastAsia="Arial" w:hAnsi="Arial"/>
+                <w:b/>
+                <w:bCs/>
+                <w:color w:val="1E293B"/>
+                <w:sz w:val="21"/>
+                <w:szCs w:val="21"/>
+              </w:rPr>
+              <w:t xml:space="preserve">Dark Mode</w:t>
+            </w:r>
+          </w:p>
+        </w:tc>
+        <w:tc>
+          <w:tcPr>
+            <w:tcW w:type="dxa" w:w="6160"/>
+            <w:tcBorders>
+              <w:top w:val="single" w:color="E2E8F0" w:sz="1"/>
+              <w:left w:val="single" w:color="E2E8F0" w:sz="1"/>
+              <w:bottom w:val="single" w:color="E2E8F0" w:sz="1"/>
+              <w:right w:val="single" w:color="E2E8F0" w:sz="1"/>
+            </w:tcBorders>
+            <w:tcMar>
+              <w:top w:type="dxa" w:w="60"/>
+              <w:left w:type="dxa" w:w="100"/>
+              <w:bottom w:type="dxa" w:w="60"/>
+              <w:right w:type="dxa" w:w="100"/>
+            </w:tcMar>
+          </w:tcPr>
+          <w:p>
+            <w:r>
+              <w:rPr>
+                <w:rFonts w:ascii="Arial" w:cs="Arial" w:eastAsia="Arial" w:hAnsi="Arial"/>
+                <w:color w:val="64748B"/>
+                <w:sz w:val="21"/>
+                <w:szCs w:val="21"/>
+              </w:rPr>
+              <w:t xml:space="preserve">Full dark mode on all pages including landing</w:t>
             </w:r>
           </w:p>
         </w:tc>
@@ -1045,7 +1160,7 @@
                 <w:sz w:val="21"/>
                 <w:szCs w:val="21"/>
               </w:rPr>
-              <w:t xml:space="preserve">Generate professional resumes with 5 templates (Modern, Simple, Executive, Creative, Minimal) in EN/RU/HY</w:t>
+              <w:t xml:space="preserve">5 templates (Modern, Simple, Executive, Creative, Minimal) in EN/RU/HY with PDF export</w:t>
             </w:r>
           </w:p>
         </w:tc>
@@ -1105,7 +1220,7 @@
                 <w:sz w:val="21"/>
                 <w:szCs w:val="21"/>
               </w:rPr>
-              <w:t xml:space="preserve">Auto-customize resume keywords and content for each specific job description with match improvement tracking</w:t>
+              <w:t xml:space="preserve">Auto-customize keywords and content per job description with match improvement %</w:t>
             </w:r>
           </w:p>
         </w:tc>
@@ -1165,7 +1280,7 @@
                 <w:sz w:val="21"/>
                 <w:szCs w:val="21"/>
               </w:rPr>
-              <w:t xml:space="preserve">Upload PDF/DOCX/TXT — AI parses name, role, skills, experience, education into your profile automatically</w:t>
+              <w:t xml:space="preserve">Upload PDF/DOCX/TXT — AI parses name, role, skills, experience into profile</w:t>
             </w:r>
           </w:p>
         </w:tc>
@@ -1225,7 +1340,7 @@
                 <w:sz w:val="21"/>
                 <w:szCs w:val="21"/>
               </w:rPr>
-              <w:t xml:space="preserve">AI-generated personal portfolio websites with 4 themes. Public pages at /p/[slug]</w:t>
+              <w:t xml:space="preserve">AI-generated personal sites with 4 themes. Public pages at /p/[slug]</w:t>
             </w:r>
           </w:p>
         </w:tc>
@@ -1285,7 +1400,7 @@
                 <w:sz w:val="21"/>
                 <w:szCs w:val="21"/>
               </w:rPr>
-              <w:t xml:space="preserve">AI scores your LinkedIn profile (0-100) and suggests headline, about section, skills to add/remove</w:t>
+              <w:t xml:space="preserve">AI scores LinkedIn profile 0-100, suggests headline, about, skills to add/remove</w:t>
             </w:r>
           </w:p>
         </w:tc>
@@ -1345,7 +1460,7 @@
                 <w:sz w:val="21"/>
                 <w:szCs w:val="21"/>
               </w:rPr>
-              <w:t xml:space="preserve">Client-side resume export to PDF with html2canvas + jsPDF</w:t>
+              <w:t xml:space="preserve">Client-side resume export with html2canvas + jsPDF</w:t>
             </w:r>
           </w:p>
         </w:tc>
@@ -1473,7 +1588,7 @@
                 <w:sz w:val="21"/>
                 <w:szCs w:val="21"/>
               </w:rPr>
-              <w:t xml:space="preserve">Paste any hh.ru or staff.am URL — AI extracts title, company, description, salary, location automatically</w:t>
+              <w:t xml:space="preserve">Paste hh.ru or staff.am URL — AI extracts all details. Duplicate detection built-in</w:t>
             </w:r>
           </w:p>
         </w:tc>
@@ -1533,7 +1648,7 @@
                 <w:sz w:val="21"/>
                 <w:szCs w:val="21"/>
               </w:rPr>
-              <w:t xml:space="preserve">Search across hh.ru and staff.am with keyword filters and source selection</w:t>
+              <w:t xml:space="preserve">Search hh.ru and staff.am with keyword filters</w:t>
             </w:r>
           </w:p>
         </w:tc>
@@ -1593,7 +1708,7 @@
                 <w:sz w:val="21"/>
                 <w:szCs w:val="21"/>
               </w:rPr>
-              <w:t xml:space="preserve">Autonomous agents that search for jobs 24/7 with keywords, locations, and frequency settings (hourly/daily/weekly)</w:t>
+              <w:t xml:space="preserve">Autonomous agents search 24/7 with keywords, locations, frequency (hourly/daily/weekly)</w:t>
             </w:r>
           </w:p>
         </w:tc>
@@ -1653,7 +1768,7 @@
                 <w:sz w:val="21"/>
                 <w:szCs w:val="21"/>
               </w:rPr>
-              <w:t xml:space="preserve">Select multiple jobs and apply to all at once with AI-generated cover letters and human-like delays</w:t>
+              <w:t xml:space="preserve">Select multiple jobs, apply to all with AI cover letters and human-like delays</w:t>
             </w:r>
           </w:p>
         </w:tc>
@@ -1713,7 +1828,7 @@
                 <w:sz w:val="21"/>
                 <w:szCs w:val="21"/>
               </w:rPr>
-              <w:t xml:space="preserve">Playwright-based automation for hh.ru and staff.am with human-like typing (30-130ms per char)</w:t>
+              <w:t xml:space="preserve">Playwright automation for hh.ru/staff.am with human-like typing (30-130ms)</w:t>
             </w:r>
           </w:p>
         </w:tc>
@@ -1773,7 +1888,7 @@
                 <w:sz w:val="21"/>
                 <w:szCs w:val="21"/>
               </w:rPr>
-              <w:t xml:space="preserve">Personalized job suggestions based on your profile, skills, and application history</w:t>
+              <w:t xml:space="preserve">Personalized job suggestions based on profile + application history</w:t>
             </w:r>
           </w:p>
         </w:tc>
@@ -1833,7 +1948,67 @@
                 <w:sz w:val="21"/>
                 <w:szCs w:val="21"/>
               </w:rPr>
-              <w:t xml:space="preserve">Inline Save/Quick Apply buttons injected on job pages. Stats popup, quick navigation</w:t>
+              <w:t xml:space="preserve">Inline Save/Quick Apply buttons on job pages, stats popup, quick nav</w:t>
+            </w:r>
+          </w:p>
+        </w:tc>
+      </w:tr>
+      <w:tr>
+        <w:tc>
+          <w:tcPr>
+            <w:tcW w:type="dxa" w:w="3200"/>
+            <w:tcBorders>
+              <w:top w:val="single" w:color="E2E8F0" w:sz="1"/>
+              <w:left w:val="single" w:color="E2E8F0" w:sz="1"/>
+              <w:bottom w:val="single" w:color="E2E8F0" w:sz="1"/>
+              <w:right w:val="single" w:color="E2E8F0" w:sz="1"/>
+            </w:tcBorders>
+            <w:tcMar>
+              <w:top w:type="dxa" w:w="60"/>
+              <w:left w:type="dxa" w:w="100"/>
+              <w:bottom w:type="dxa" w:w="60"/>
+              <w:right w:type="dxa" w:w="100"/>
+            </w:tcMar>
+          </w:tcPr>
+          <w:p>
+            <w:r>
+              <w:rPr>
+                <w:rFonts w:ascii="Arial" w:cs="Arial" w:eastAsia="Arial" w:hAnsi="Arial"/>
+                <w:b/>
+                <w:bCs/>
+                <w:color w:val="1E293B"/>
+                <w:sz w:val="21"/>
+                <w:szCs w:val="21"/>
+              </w:rPr>
+              <w:t xml:space="preserve">CSV Import</w:t>
+            </w:r>
+          </w:p>
+        </w:tc>
+        <w:tc>
+          <w:tcPr>
+            <w:tcW w:type="dxa" w:w="6160"/>
+            <w:tcBorders>
+              <w:top w:val="single" w:color="E2E8F0" w:sz="1"/>
+              <w:left w:val="single" w:color="E2E8F0" w:sz="1"/>
+              <w:bottom w:val="single" w:color="E2E8F0" w:sz="1"/>
+              <w:right w:val="single" w:color="E2E8F0" w:sz="1"/>
+            </w:tcBorders>
+            <w:tcMar>
+              <w:top w:type="dxa" w:w="60"/>
+              <w:left w:type="dxa" w:w="100"/>
+              <w:bottom w:type="dxa" w:w="60"/>
+              <w:right w:type="dxa" w:w="100"/>
+            </w:tcMar>
+          </w:tcPr>
+          <w:p>
+            <w:r>
+              <w:rPr>
+                <w:rFonts w:ascii="Arial" w:cs="Arial" w:eastAsia="Arial" w:hAnsi="Arial"/>
+                <w:color w:val="64748B"/>
+                <w:sz w:val="21"/>
+                <w:szCs w:val="21"/>
+              </w:rPr>
+              <w:t xml:space="preserve">Bulk import applications from spreadsheet (Job Title, Company, Status, etc.)</w:t>
             </w:r>
           </w:p>
         </w:tc>
@@ -1961,67 +2136,127 @@
                 <w:sz w:val="21"/>
                 <w:szCs w:val="21"/>
               </w:rPr>
-              <w:t xml:space="preserve">Drag-and-drop tracker: Saved → Applied → Interview → Offer → Rejected with @dnd-kit</w:t>
-            </w:r>
-          </w:p>
-        </w:tc>
-      </w:tr>
-      <w:tr>
-        <w:tc>
-          <w:tcPr>
-            <w:tcW w:type="dxa" w:w="3200"/>
-            <w:tcBorders>
-              <w:top w:val="single" w:color="E2E8F0" w:sz="1"/>
-              <w:left w:val="single" w:color="E2E8F0" w:sz="1"/>
-              <w:bottom w:val="single" w:color="E2E8F0" w:sz="1"/>
-              <w:right w:val="single" w:color="E2E8F0" w:sz="1"/>
-            </w:tcBorders>
-            <w:tcMar>
-              <w:top w:type="dxa" w:w="60"/>
-              <w:left w:type="dxa" w:w="100"/>
-              <w:bottom w:type="dxa" w:w="60"/>
-              <w:right w:type="dxa" w:w="100"/>
-            </w:tcMar>
-          </w:tcPr>
-          <w:p>
-            <w:r>
-              <w:rPr>
-                <w:rFonts w:ascii="Arial" w:cs="Arial" w:eastAsia="Arial" w:hAnsi="Arial"/>
-                <w:b/>
-                <w:bCs/>
-                <w:color w:val="1E293B"/>
-                <w:sz w:val="21"/>
-                <w:szCs w:val="21"/>
-              </w:rPr>
-              <w:t xml:space="preserve">Application Calendar</w:t>
-            </w:r>
-          </w:p>
-        </w:tc>
-        <w:tc>
-          <w:tcPr>
-            <w:tcW w:type="dxa" w:w="6160"/>
-            <w:tcBorders>
-              <w:top w:val="single" w:color="E2E8F0" w:sz="1"/>
-              <w:left w:val="single" w:color="E2E8F0" w:sz="1"/>
-              <w:bottom w:val="single" w:color="E2E8F0" w:sz="1"/>
-              <w:right w:val="single" w:color="E2E8F0" w:sz="1"/>
-            </w:tcBorders>
-            <w:tcMar>
-              <w:top w:type="dxa" w:w="60"/>
-              <w:left w:type="dxa" w:w="100"/>
-              <w:bottom w:type="dxa" w:w="60"/>
-              <w:right w:type="dxa" w:w="100"/>
-            </w:tcMar>
-          </w:tcPr>
-          <w:p>
-            <w:r>
-              <w:rPr>
-                <w:rFonts w:ascii="Arial" w:cs="Arial" w:eastAsia="Arial" w:hAnsi="Arial"/>
-                <w:color w:val="64748B"/>
-                <w:sz w:val="21"/>
-                <w:szCs w:val="21"/>
-              </w:rPr>
-              <w:t xml:space="preserve">Monthly calendar view with color-coded status badges and upcoming interviews section</w:t>
+              <w:t xml:space="preserve">Drag-and-drop: Saved → Applied → Interview → Offer → Rejected</w:t>
+            </w:r>
+          </w:p>
+        </w:tc>
+      </w:tr>
+      <w:tr>
+        <w:tc>
+          <w:tcPr>
+            <w:tcW w:type="dxa" w:w="3200"/>
+            <w:tcBorders>
+              <w:top w:val="single" w:color="E2E8F0" w:sz="1"/>
+              <w:left w:val="single" w:color="E2E8F0" w:sz="1"/>
+              <w:bottom w:val="single" w:color="E2E8F0" w:sz="1"/>
+              <w:right w:val="single" w:color="E2E8F0" w:sz="1"/>
+            </w:tcBorders>
+            <w:tcMar>
+              <w:top w:type="dxa" w:w="60"/>
+              <w:left w:type="dxa" w:w="100"/>
+              <w:bottom w:type="dxa" w:w="60"/>
+              <w:right w:type="dxa" w:w="100"/>
+            </w:tcMar>
+          </w:tcPr>
+          <w:p>
+            <w:r>
+              <w:rPr>
+                <w:rFonts w:ascii="Arial" w:cs="Arial" w:eastAsia="Arial" w:hAnsi="Arial"/>
+                <w:b/>
+                <w:bCs/>
+                <w:color w:val="1E293B"/>
+                <w:sz w:val="21"/>
+                <w:szCs w:val="21"/>
+              </w:rPr>
+              <w:t xml:space="preserve">Delete with Confirmation</w:t>
+            </w:r>
+          </w:p>
+        </w:tc>
+        <w:tc>
+          <w:tcPr>
+            <w:tcW w:type="dxa" w:w="6160"/>
+            <w:tcBorders>
+              <w:top w:val="single" w:color="E2E8F0" w:sz="1"/>
+              <w:left w:val="single" w:color="E2E8F0" w:sz="1"/>
+              <w:bottom w:val="single" w:color="E2E8F0" w:sz="1"/>
+              <w:right w:val="single" w:color="E2E8F0" w:sz="1"/>
+            </w:tcBorders>
+            <w:tcMar>
+              <w:top w:type="dxa" w:w="60"/>
+              <w:left w:type="dxa" w:w="100"/>
+              <w:bottom w:type="dxa" w:w="60"/>
+              <w:right w:type="dxa" w:w="100"/>
+            </w:tcMar>
+          </w:tcPr>
+          <w:p>
+            <w:r>
+              <w:rPr>
+                <w:rFonts w:ascii="Arial" w:cs="Arial" w:eastAsia="Arial" w:hAnsi="Arial"/>
+                <w:color w:val="64748B"/>
+                <w:sz w:val="21"/>
+                <w:szCs w:val="21"/>
+              </w:rPr>
+              <w:t xml:space="preserve">Remove applications with "Are you sure?" dialog</w:t>
+            </w:r>
+          </w:p>
+        </w:tc>
+      </w:tr>
+      <w:tr>
+        <w:tc>
+          <w:tcPr>
+            <w:tcW w:type="dxa" w:w="3200"/>
+            <w:tcBorders>
+              <w:top w:val="single" w:color="E2E8F0" w:sz="1"/>
+              <w:left w:val="single" w:color="E2E8F0" w:sz="1"/>
+              <w:bottom w:val="single" w:color="E2E8F0" w:sz="1"/>
+              <w:right w:val="single" w:color="E2E8F0" w:sz="1"/>
+            </w:tcBorders>
+            <w:tcMar>
+              <w:top w:type="dxa" w:w="60"/>
+              <w:left w:type="dxa" w:w="100"/>
+              <w:bottom w:type="dxa" w:w="60"/>
+              <w:right w:type="dxa" w:w="100"/>
+            </w:tcMar>
+          </w:tcPr>
+          <w:p>
+            <w:r>
+              <w:rPr>
+                <w:rFonts w:ascii="Arial" w:cs="Arial" w:eastAsia="Arial" w:hAnsi="Arial"/>
+                <w:b/>
+                <w:bCs/>
+                <w:color w:val="1E293B"/>
+                <w:sz w:val="21"/>
+                <w:szCs w:val="21"/>
+              </w:rPr>
+              <w:t xml:space="preserve">Calendar</w:t>
+            </w:r>
+          </w:p>
+        </w:tc>
+        <w:tc>
+          <w:tcPr>
+            <w:tcW w:type="dxa" w:w="6160"/>
+            <w:tcBorders>
+              <w:top w:val="single" w:color="E2E8F0" w:sz="1"/>
+              <w:left w:val="single" w:color="E2E8F0" w:sz="1"/>
+              <w:bottom w:val="single" w:color="E2E8F0" w:sz="1"/>
+              <w:right w:val="single" w:color="E2E8F0" w:sz="1"/>
+            </w:tcBorders>
+            <w:tcMar>
+              <w:top w:type="dxa" w:w="60"/>
+              <w:left w:type="dxa" w:w="100"/>
+              <w:bottom w:type="dxa" w:w="60"/>
+              <w:right w:type="dxa" w:w="100"/>
+            </w:tcMar>
+          </w:tcPr>
+          <w:p>
+            <w:r>
+              <w:rPr>
+                <w:rFonts w:ascii="Arial" w:cs="Arial" w:eastAsia="Arial" w:hAnsi="Arial"/>
+                <w:color w:val="64748B"/>
+                <w:sz w:val="21"/>
+                <w:szCs w:val="21"/>
+              </w:rPr>
+              <w:t xml:space="preserve">Monthly view with color-coded status, custom events (interview/deadline/follow-up), ICS export</w:t>
             </w:r>
           </w:p>
         </w:tc>
@@ -2081,7 +2316,7 @@
                 <w:sz w:val="21"/>
                 <w:szCs w:val="21"/>
               </w:rPr>
-              <w:t xml:space="preserve">GitHub-style 20-week contribution grid showing daily application activity</w:t>
+              <w:t xml:space="preserve">GitHub-style 20-week contribution grid</w:t>
             </w:r>
           </w:p>
         </w:tc>
@@ -2141,7 +2376,7 @@
                 <w:sz w:val="21"/>
                 <w:szCs w:val="21"/>
               </w:rPr>
-              <w:t xml:space="preserve">Track recruiters, hiring managers with tags, LinkedIn, follow-up dates, and notes</w:t>
+              <w:t xml:space="preserve">Track recruiters/hiring managers with tags, LinkedIn, follow-up dates</w:t>
             </w:r>
           </w:p>
         </w:tc>
@@ -2201,7 +2436,7 @@
                 <w:sz w:val="21"/>
                 <w:szCs w:val="21"/>
               </w:rPr>
-              <w:t xml:space="preserve">Store offer letters, contracts, certificates, and references</w:t>
+              <w:t xml:space="preserve">Store offer letters, contracts, certificates, references</w:t>
             </w:r>
           </w:p>
         </w:tc>
@@ -2261,7 +2496,67 @@
                 <w:sz w:val="21"/>
                 <w:szCs w:val="21"/>
               </w:rPr>
-              <w:t xml:space="preserve">Download all application data as CSV for external analysis</w:t>
+              <w:t xml:space="preserve">Download all application data as CSV</w:t>
+            </w:r>
+          </w:p>
+        </w:tc>
+      </w:tr>
+      <w:tr>
+        <w:tc>
+          <w:tcPr>
+            <w:tcW w:type="dxa" w:w="3200"/>
+            <w:tcBorders>
+              <w:top w:val="single" w:color="E2E8F0" w:sz="1"/>
+              <w:left w:val="single" w:color="E2E8F0" w:sz="1"/>
+              <w:bottom w:val="single" w:color="E2E8F0" w:sz="1"/>
+              <w:right w:val="single" w:color="E2E8F0" w:sz="1"/>
+            </w:tcBorders>
+            <w:tcMar>
+              <w:top w:type="dxa" w:w="60"/>
+              <w:left w:type="dxa" w:w="100"/>
+              <w:bottom w:type="dxa" w:w="60"/>
+              <w:right w:type="dxa" w:w="100"/>
+            </w:tcMar>
+          </w:tcPr>
+          <w:p>
+            <w:r>
+              <w:rPr>
+                <w:rFonts w:ascii="Arial" w:cs="Arial" w:eastAsia="Arial" w:hAnsi="Arial"/>
+                <w:b/>
+                <w:bCs/>
+                <w:color w:val="1E293B"/>
+                <w:sz w:val="21"/>
+                <w:szCs w:val="21"/>
+              </w:rPr>
+              <w:t xml:space="preserve">Global Search</w:t>
+            </w:r>
+          </w:p>
+        </w:tc>
+        <w:tc>
+          <w:tcPr>
+            <w:tcW w:type="dxa" w:w="6160"/>
+            <w:tcBorders>
+              <w:top w:val="single" w:color="E2E8F0" w:sz="1"/>
+              <w:left w:val="single" w:color="E2E8F0" w:sz="1"/>
+              <w:bottom w:val="single" w:color="E2E8F0" w:sz="1"/>
+              <w:right w:val="single" w:color="E2E8F0" w:sz="1"/>
+            </w:tcBorders>
+            <w:tcMar>
+              <w:top w:type="dxa" w:w="60"/>
+              <w:left w:type="dxa" w:w="100"/>
+              <w:bottom w:type="dxa" w:w="60"/>
+              <w:right w:type="dxa" w:w="100"/>
+            </w:tcMar>
+          </w:tcPr>
+          <w:p>
+            <w:r>
+              <w:rPr>
+                <w:rFonts w:ascii="Arial" w:cs="Arial" w:eastAsia="Arial" w:hAnsi="Arial"/>
+                <w:color w:val="64748B"/>
+                <w:sz w:val="21"/>
+                <w:szCs w:val="21"/>
+              </w:rPr>
+              <w:t xml:space="preserve">CMD+K searches across jobs, applications, contacts, documents in real-time</w:t>
             </w:r>
           </w:p>
         </w:tc>
@@ -2286,7 +2581,7 @@
           <w:sz w:val="36"/>
           <w:szCs w:val="36"/>
         </w:rPr>
-        <w:t xml:space="preserve">AI-Powered Tools</w:t>
+        <w:t xml:space="preserve">AI-Powered Tools (16 Functions)</w:t>
       </w:r>
     </w:p>
     <w:tbl>
@@ -2394,7 +2689,7 @@
                 <w:sz w:val="21"/>
                 <w:szCs w:val="21"/>
               </w:rPr>
-              <w:t xml:space="preserve">Personalized cover letters from your profile + job description in EN/RU/HY</w:t>
+              <w:t xml:space="preserve">Personalized cover letters from profile + job description in EN/RU/HY</w:t>
             </w:r>
           </w:p>
         </w:tc>
@@ -2454,67 +2749,67 @@
                 <w:sz w:val="21"/>
                 <w:szCs w:val="21"/>
               </w:rPr>
-              <w:t xml:space="preserve">Score resumes 0-100 against job descriptions with keyword analysis and section breakdown</w:t>
-            </w:r>
-          </w:p>
-        </w:tc>
-      </w:tr>
-      <w:tr>
-        <w:tc>
-          <w:tcPr>
-            <w:tcW w:type="dxa" w:w="3200"/>
-            <w:tcBorders>
-              <w:top w:val="single" w:color="E2E8F0" w:sz="1"/>
-              <w:left w:val="single" w:color="E2E8F0" w:sz="1"/>
-              <w:bottom w:val="single" w:color="E2E8F0" w:sz="1"/>
-              <w:right w:val="single" w:color="E2E8F0" w:sz="1"/>
-            </w:tcBorders>
-            <w:tcMar>
-              <w:top w:type="dxa" w:w="60"/>
-              <w:left w:type="dxa" w:w="100"/>
-              <w:bottom w:type="dxa" w:w="60"/>
-              <w:right w:type="dxa" w:w="100"/>
-            </w:tcMar>
-          </w:tcPr>
-          <w:p>
-            <w:r>
-              <w:rPr>
-                <w:rFonts w:ascii="Arial" w:cs="Arial" w:eastAsia="Arial" w:hAnsi="Arial"/>
-                <w:b/>
-                <w:bCs/>
-                <w:color w:val="1E293B"/>
-                <w:sz w:val="21"/>
-                <w:szCs w:val="21"/>
-              </w:rPr>
-              <w:t xml:space="preserve">Mock Interview Simulator</w:t>
-            </w:r>
-          </w:p>
-        </w:tc>
-        <w:tc>
-          <w:tcPr>
-            <w:tcW w:type="dxa" w:w="6160"/>
-            <w:tcBorders>
-              <w:top w:val="single" w:color="E2E8F0" w:sz="1"/>
-              <w:left w:val="single" w:color="E2E8F0" w:sz="1"/>
-              <w:bottom w:val="single" w:color="E2E8F0" w:sz="1"/>
-              <w:right w:val="single" w:color="E2E8F0" w:sz="1"/>
-            </w:tcBorders>
-            <w:tcMar>
-              <w:top w:type="dxa" w:w="60"/>
-              <w:left w:type="dxa" w:w="100"/>
-              <w:bottom w:type="dxa" w:w="60"/>
-              <w:right w:type="dxa" w:w="100"/>
-            </w:tcMar>
-          </w:tcPr>
-          <w:p>
-            <w:r>
-              <w:rPr>
-                <w:rFonts w:ascii="Arial" w:cs="Arial" w:eastAsia="Arial" w:hAnsi="Arial"/>
-                <w:color w:val="64748B"/>
-                <w:sz w:val="21"/>
-                <w:szCs w:val="21"/>
-              </w:rPr>
-              <w:t xml:space="preserve">Interactive AI interviewer with real-time scoring (1-10), strengths, improvements, and ideal answers</w:t>
+              <w:t xml:space="preserve">Score resumes 0-100 with keyword analysis, section breakdown, improvements</w:t>
+            </w:r>
+          </w:p>
+        </w:tc>
+      </w:tr>
+      <w:tr>
+        <w:tc>
+          <w:tcPr>
+            <w:tcW w:type="dxa" w:w="3200"/>
+            <w:tcBorders>
+              <w:top w:val="single" w:color="E2E8F0" w:sz="1"/>
+              <w:left w:val="single" w:color="E2E8F0" w:sz="1"/>
+              <w:bottom w:val="single" w:color="E2E8F0" w:sz="1"/>
+              <w:right w:val="single" w:color="E2E8F0" w:sz="1"/>
+            </w:tcBorders>
+            <w:tcMar>
+              <w:top w:type="dxa" w:w="60"/>
+              <w:left w:type="dxa" w:w="100"/>
+              <w:bottom w:type="dxa" w:w="60"/>
+              <w:right w:type="dxa" w:w="100"/>
+            </w:tcMar>
+          </w:tcPr>
+          <w:p>
+            <w:r>
+              <w:rPr>
+                <w:rFonts w:ascii="Arial" w:cs="Arial" w:eastAsia="Arial" w:hAnsi="Arial"/>
+                <w:b/>
+                <w:bCs/>
+                <w:color w:val="1E293B"/>
+                <w:sz w:val="21"/>
+                <w:szCs w:val="21"/>
+              </w:rPr>
+              <w:t xml:space="preserve">Mock Interview</w:t>
+            </w:r>
+          </w:p>
+        </w:tc>
+        <w:tc>
+          <w:tcPr>
+            <w:tcW w:type="dxa" w:w="6160"/>
+            <w:tcBorders>
+              <w:top w:val="single" w:color="E2E8F0" w:sz="1"/>
+              <w:left w:val="single" w:color="E2E8F0" w:sz="1"/>
+              <w:bottom w:val="single" w:color="E2E8F0" w:sz="1"/>
+              <w:right w:val="single" w:color="E2E8F0" w:sz="1"/>
+            </w:tcBorders>
+            <w:tcMar>
+              <w:top w:type="dxa" w:w="60"/>
+              <w:left w:type="dxa" w:w="100"/>
+              <w:bottom w:type="dxa" w:w="60"/>
+              <w:right w:type="dxa" w:w="100"/>
+            </w:tcMar>
+          </w:tcPr>
+          <w:p>
+            <w:r>
+              <w:rPr>
+                <w:rFonts w:ascii="Arial" w:cs="Arial" w:eastAsia="Arial" w:hAnsi="Arial"/>
+                <w:color w:val="64748B"/>
+                <w:sz w:val="21"/>
+                <w:szCs w:val="21"/>
+              </w:rPr>
+              <w:t xml:space="preserve">Interactive AI interviewer with scoring 1-10, strengths, improvements, ideal answers</w:t>
             </w:r>
           </w:p>
         </w:tc>
@@ -2574,7 +2869,7 @@
                 <w:sz w:val="21"/>
                 <w:szCs w:val="21"/>
               </w:rPr>
-              <w:t xml:space="preserve">AI generates 8-10 questions per job with difficulty levels, suggested answers, and company research</w:t>
+              <w:t xml:space="preserve">8-10 questions per job with difficulty levels, answers, company research</w:t>
             </w:r>
           </w:p>
         </w:tc>
@@ -2634,7 +2929,7 @@
                 <w:sz w:val="21"/>
                 <w:szCs w:val="21"/>
               </w:rPr>
-              <w:t xml:space="preserve">"Why You Got Rejected" — gap analysis between your profile and job requirements with severity levels</w:t>
+              <w:t xml:space="preserve">Gap analysis between profile and job: skills, experience, education, seniority</w:t>
             </w:r>
           </w:p>
         </w:tc>
@@ -2694,7 +2989,7 @@
                 <w:sz w:val="21"/>
                 <w:szCs w:val="21"/>
               </w:rPr>
-              <w:t xml:space="preserve">Aggregated insights across all rejection analyses showing most common gaps and frequency</w:t>
+              <w:t xml:space="preserve">Aggregated insights across all analyses: most common gaps, frequency, actions</w:t>
             </w:r>
           </w:p>
         </w:tc>
@@ -2754,7 +3049,7 @@
                 <w:sz w:val="21"/>
                 <w:szCs w:val="21"/>
               </w:rPr>
-              <w:t xml:space="preserve">AI research on any company: culture, salary range, interview process, pros/cons, rating</w:t>
+              <w:t xml:space="preserve">AI research: culture, salary, interview process, pros/cons, rating</w:t>
             </w:r>
           </w:p>
         </w:tc>
@@ -2814,7 +3109,7 @@
                 <w:sz w:val="21"/>
                 <w:szCs w:val="21"/>
               </w:rPr>
-              <w:t xml:space="preserve">Salary trends, demand levels, top skills, and career advice by role and location</w:t>
+              <w:t xml:space="preserve">Salary trends, demand levels, top skills, career advice by role/location</w:t>
             </w:r>
           </w:p>
         </w:tc>
@@ -2874,7 +3169,7 @@
                 <w:sz w:val="21"/>
                 <w:szCs w:val="21"/>
               </w:rPr>
-              <w:t xml:space="preserve">AI generates counter-offer strategy with market data, talking points, risk level, and email script</w:t>
+              <w:t xml:space="preserve">Counter-offer strategy with market data, talking points, risk level, email script</w:t>
             </w:r>
           </w:p>
         </w:tc>
@@ -2934,7 +3229,7 @@
                 <w:sz w:val="21"/>
                 <w:szCs w:val="21"/>
               </w:rPr>
-              <w:t xml:space="preserve">5 types: post-interview, post-application, no response, rejection, networking in EN/RU</w:t>
+              <w:t xml:space="preserve">5 types: post-interview, post-application, no response, rejection, networking</w:t>
             </w:r>
           </w:p>
         </w:tc>
@@ -2994,7 +3289,7 @@
                 <w:sz w:val="21"/>
                 <w:szCs w:val="21"/>
               </w:rPr>
-              <w:t xml:space="preserve">AI cold outreach to recruiters and hiring managers</w:t>
+              <w:t xml:space="preserve">Cold outreach to recruiters and hiring managers</w:t>
             </w:r>
           </w:p>
         </w:tc>
@@ -3054,315 +3349,67 @@
                 <w:sz w:val="21"/>
                 <w:szCs w:val="21"/>
               </w:rPr>
-              <w:t xml:space="preserve">Conversational career coach with full context of your profile, applications, and history</w:t>
-            </w:r>
-          </w:p>
-        </w:tc>
-      </w:tr>
-    </w:tbl>
-    <w:p>
-      <w:pPr>
-        <w:pStyle w:val="Heading2"/>
-        <w:spacing w:after="120" w:before="240"/>
-      </w:pPr>
-      <w:r>
-        <w:rPr>
-          <w:rFonts w:ascii="Arial" w:cs="Arial" w:eastAsia="Arial" w:hAnsi="Arial"/>
-          <w:b/>
-          <w:bCs/>
-          <w:color w:val="1E293B"/>
-          <w:sz w:val="28"/>
-          <w:szCs w:val="28"/>
-        </w:rPr>
-        <w:t xml:space="preserve">Offer Comparison</w:t>
-      </w:r>
-    </w:p>
-    <w:tbl>
-      <w:tblPr>
-        <w:tblW w:type="dxa" w:w="9360"/>
-        <w:tblBorders>
-          <w:top w:val="single" w:color="auto" w:sz="4"/>
-          <w:left w:val="single" w:color="auto" w:sz="4"/>
-          <w:bottom w:val="single" w:color="auto" w:sz="4"/>
-          <w:right w:val="single" w:color="auto" w:sz="4"/>
-          <w:insideH w:val="single" w:color="auto" w:sz="4"/>
-          <w:insideV w:val="single" w:color="auto" w:sz="4"/>
-        </w:tblBorders>
-      </w:tblPr>
-      <w:tblGrid>
-        <w:gridCol w:w="3200"/>
-        <w:gridCol w:w="6160"/>
-      </w:tblGrid>
-      <w:tr>
-        <w:tc>
-          <w:tcPr>
-            <w:tcW w:type="dxa" w:w="9360"/>
-            <w:gridSpan w:val="2"/>
-            <w:tcBorders>
-              <w:top w:val="single" w:color="E2E8F0" w:sz="1"/>
-              <w:left w:val="single" w:color="E2E8F0" w:sz="1"/>
-              <w:bottom w:val="single" w:color="E2E8F0" w:sz="1"/>
-              <w:right w:val="single" w:color="E2E8F0" w:sz="1"/>
-            </w:tcBorders>
-            <w:shd w:fill="2563EB" w:val="clear"/>
-            <w:tcMar>
-              <w:top w:type="dxa" w:w="80"/>
-              <w:left w:type="dxa" w:w="100"/>
-              <w:bottom w:type="dxa" w:w="80"/>
-              <w:right w:type="dxa" w:w="100"/>
-            </w:tcMar>
-          </w:tcPr>
-          <w:p>
-            <w:r>
-              <w:rPr>
-                <w:rFonts w:ascii="Arial" w:cs="Arial" w:eastAsia="Arial" w:hAnsi="Arial"/>
-                <w:b/>
-                <w:bCs/>
-                <w:color w:val="FFFFFF"/>
-                <w:sz w:val="22"/>
-                <w:szCs w:val="22"/>
-              </w:rPr>
-              <w:t xml:space="preserve">Offer Management</w:t>
-            </w:r>
-          </w:p>
-        </w:tc>
-      </w:tr>
-      <w:tr>
-        <w:tc>
-          <w:tcPr>
-            <w:tcW w:type="dxa" w:w="3200"/>
-            <w:tcBorders>
-              <w:top w:val="single" w:color="E2E8F0" w:sz="1"/>
-              <w:left w:val="single" w:color="E2E8F0" w:sz="1"/>
-              <w:bottom w:val="single" w:color="E2E8F0" w:sz="1"/>
-              <w:right w:val="single" w:color="E2E8F0" w:sz="1"/>
-            </w:tcBorders>
-            <w:tcMar>
-              <w:top w:type="dxa" w:w="60"/>
-              <w:left w:type="dxa" w:w="100"/>
-              <w:bottom w:type="dxa" w:w="60"/>
-              <w:right w:type="dxa" w:w="100"/>
-            </w:tcMar>
-          </w:tcPr>
-          <w:p>
-            <w:r>
-              <w:rPr>
-                <w:rFonts w:ascii="Arial" w:cs="Arial" w:eastAsia="Arial" w:hAnsi="Arial"/>
-                <w:b/>
-                <w:bCs/>
-                <w:color w:val="1E293B"/>
-                <w:sz w:val="21"/>
-                <w:szCs w:val="21"/>
-              </w:rPr>
-              <w:t xml:space="preserve">Side-by-Side Comparison</w:t>
-            </w:r>
-          </w:p>
-        </w:tc>
-        <w:tc>
-          <w:tcPr>
-            <w:tcW w:type="dxa" w:w="6160"/>
-            <w:tcBorders>
-              <w:top w:val="single" w:color="E2E8F0" w:sz="1"/>
-              <w:left w:val="single" w:color="E2E8F0" w:sz="1"/>
-              <w:bottom w:val="single" w:color="E2E8F0" w:sz="1"/>
-              <w:right w:val="single" w:color="E2E8F0" w:sz="1"/>
-            </w:tcBorders>
-            <w:tcMar>
-              <w:top w:type="dxa" w:w="60"/>
-              <w:left w:type="dxa" w:w="100"/>
-              <w:bottom w:type="dxa" w:w="60"/>
-              <w:right w:type="dxa" w:w="100"/>
-            </w:tcMar>
-          </w:tcPr>
-          <w:p>
-            <w:r>
-              <w:rPr>
-                <w:rFonts w:ascii="Arial" w:cs="Arial" w:eastAsia="Arial" w:hAnsi="Arial"/>
-                <w:color w:val="64748B"/>
-                <w:sz w:val="21"/>
-                <w:szCs w:val="21"/>
-              </w:rPr>
-              <w:t xml:space="preserve">Compare multiple job offers across salary, benefits, remote policy, PTO, commute, equity</w:t>
-            </w:r>
-          </w:p>
-        </w:tc>
-      </w:tr>
-      <w:tr>
-        <w:tc>
-          <w:tcPr>
-            <w:tcW w:type="dxa" w:w="3200"/>
-            <w:tcBorders>
-              <w:top w:val="single" w:color="E2E8F0" w:sz="1"/>
-              <w:left w:val="single" w:color="E2E8F0" w:sz="1"/>
-              <w:bottom w:val="single" w:color="E2E8F0" w:sz="1"/>
-              <w:right w:val="single" w:color="E2E8F0" w:sz="1"/>
-            </w:tcBorders>
-            <w:tcMar>
-              <w:top w:type="dxa" w:w="60"/>
-              <w:left w:type="dxa" w:w="100"/>
-              <w:bottom w:type="dxa" w:w="60"/>
-              <w:right w:type="dxa" w:w="100"/>
-            </w:tcMar>
-          </w:tcPr>
-          <w:p>
-            <w:r>
-              <w:rPr>
-                <w:rFonts w:ascii="Arial" w:cs="Arial" w:eastAsia="Arial" w:hAnsi="Arial"/>
-                <w:b/>
-                <w:bCs/>
-                <w:color w:val="1E293B"/>
-                <w:sz w:val="21"/>
-                <w:szCs w:val="21"/>
-              </w:rPr>
-              <w:t xml:space="preserve">AI Scoring</w:t>
-            </w:r>
-          </w:p>
-        </w:tc>
-        <w:tc>
-          <w:tcPr>
-            <w:tcW w:type="dxa" w:w="6160"/>
-            <w:tcBorders>
-              <w:top w:val="single" w:color="E2E8F0" w:sz="1"/>
-              <w:left w:val="single" w:color="E2E8F0" w:sz="1"/>
-              <w:bottom w:val="single" w:color="E2E8F0" w:sz="1"/>
-              <w:right w:val="single" w:color="E2E8F0" w:sz="1"/>
-            </w:tcBorders>
-            <w:tcMar>
-              <w:top w:type="dxa" w:w="60"/>
-              <w:left w:type="dxa" w:w="100"/>
-              <w:bottom w:type="dxa" w:w="60"/>
-              <w:right w:type="dxa" w:w="100"/>
-            </w:tcMar>
-          </w:tcPr>
-          <w:p>
-            <w:r>
-              <w:rPr>
-                <w:rFonts w:ascii="Arial" w:cs="Arial" w:eastAsia="Arial" w:hAnsi="Arial"/>
-                <w:color w:val="64748B"/>
-                <w:sz w:val="21"/>
-                <w:szCs w:val="21"/>
-              </w:rPr>
-              <w:t xml:space="preserve">Each offer scored 0-100 across Compensation, Benefits, Work-Life Balance, and Growth Potential</w:t>
-            </w:r>
-          </w:p>
-        </w:tc>
-      </w:tr>
-      <w:tr>
-        <w:tc>
-          <w:tcPr>
-            <w:tcW w:type="dxa" w:w="3200"/>
-            <w:tcBorders>
-              <w:top w:val="single" w:color="E2E8F0" w:sz="1"/>
-              <w:left w:val="single" w:color="E2E8F0" w:sz="1"/>
-              <w:bottom w:val="single" w:color="E2E8F0" w:sz="1"/>
-              <w:right w:val="single" w:color="E2E8F0" w:sz="1"/>
-            </w:tcBorders>
-            <w:tcMar>
-              <w:top w:type="dxa" w:w="60"/>
-              <w:left w:type="dxa" w:w="100"/>
-              <w:bottom w:type="dxa" w:w="60"/>
-              <w:right w:type="dxa" w:w="100"/>
-            </w:tcMar>
-          </w:tcPr>
-          <w:p>
-            <w:r>
-              <w:rPr>
-                <w:rFonts w:ascii="Arial" w:cs="Arial" w:eastAsia="Arial" w:hAnsi="Arial"/>
-                <w:b/>
-                <w:bCs/>
-                <w:color w:val="1E293B"/>
-                <w:sz w:val="21"/>
-                <w:szCs w:val="21"/>
-              </w:rPr>
-              <w:t xml:space="preserve">Multi-Currency</w:t>
-            </w:r>
-          </w:p>
-        </w:tc>
-        <w:tc>
-          <w:tcPr>
-            <w:tcW w:type="dxa" w:w="6160"/>
-            <w:tcBorders>
-              <w:top w:val="single" w:color="E2E8F0" w:sz="1"/>
-              <w:left w:val="single" w:color="E2E8F0" w:sz="1"/>
-              <w:bottom w:val="single" w:color="E2E8F0" w:sz="1"/>
-              <w:right w:val="single" w:color="E2E8F0" w:sz="1"/>
-            </w:tcBorders>
-            <w:tcMar>
-              <w:top w:type="dxa" w:w="60"/>
-              <w:left w:type="dxa" w:w="100"/>
-              <w:bottom w:type="dxa" w:w="60"/>
-              <w:right w:type="dxa" w:w="100"/>
-            </w:tcMar>
-          </w:tcPr>
-          <w:p>
-            <w:r>
-              <w:rPr>
-                <w:rFonts w:ascii="Arial" w:cs="Arial" w:eastAsia="Arial" w:hAnsi="Arial"/>
-                <w:color w:val="64748B"/>
-                <w:sz w:val="21"/>
-                <w:szCs w:val="21"/>
-              </w:rPr>
-              <w:t xml:space="preserve">Support for USD, EUR, RUB, AMD</w:t>
-            </w:r>
-          </w:p>
-        </w:tc>
-      </w:tr>
-      <w:tr>
-        <w:tc>
-          <w:tcPr>
-            <w:tcW w:type="dxa" w:w="3200"/>
-            <w:tcBorders>
-              <w:top w:val="single" w:color="E2E8F0" w:sz="1"/>
-              <w:left w:val="single" w:color="E2E8F0" w:sz="1"/>
-              <w:bottom w:val="single" w:color="E2E8F0" w:sz="1"/>
-              <w:right w:val="single" w:color="E2E8F0" w:sz="1"/>
-            </w:tcBorders>
-            <w:tcMar>
-              <w:top w:type="dxa" w:w="60"/>
-              <w:left w:type="dxa" w:w="100"/>
-              <w:bottom w:type="dxa" w:w="60"/>
-              <w:right w:type="dxa" w:w="100"/>
-            </w:tcMar>
-          </w:tcPr>
-          <w:p>
-            <w:r>
-              <w:rPr>
-                <w:rFonts w:ascii="Arial" w:cs="Arial" w:eastAsia="Arial" w:hAnsi="Arial"/>
-                <w:b/>
-                <w:bCs/>
-                <w:color w:val="1E293B"/>
-                <w:sz w:val="21"/>
-                <w:szCs w:val="21"/>
-              </w:rPr>
-              <w:t xml:space="preserve">Best Offer Highlight</w:t>
-            </w:r>
-          </w:p>
-        </w:tc>
-        <w:tc>
-          <w:tcPr>
-            <w:tcW w:type="dxa" w:w="6160"/>
-            <w:tcBorders>
-              <w:top w:val="single" w:color="E2E8F0" w:sz="1"/>
-              <w:left w:val="single" w:color="E2E8F0" w:sz="1"/>
-              <w:bottom w:val="single" w:color="E2E8F0" w:sz="1"/>
-              <w:right w:val="single" w:color="E2E8F0" w:sz="1"/>
-            </w:tcBorders>
-            <w:tcMar>
-              <w:top w:type="dxa" w:w="60"/>
-              <w:left w:type="dxa" w:w="100"/>
-              <w:bottom w:type="dxa" w:w="60"/>
-              <w:right w:type="dxa" w:w="100"/>
-            </w:tcMar>
-          </w:tcPr>
-          <w:p>
-            <w:r>
-              <w:rPr>
-                <w:rFonts w:ascii="Arial" w:cs="Arial" w:eastAsia="Arial" w:hAnsi="Arial"/>
-                <w:color w:val="64748B"/>
-                <w:sz w:val="21"/>
-                <w:szCs w:val="21"/>
-              </w:rPr>
-              <w:t xml:space="preserve">Highest-scored offer highlighted with trophy icon</w:t>
+              <w:t xml:space="preserve">Conversational career coach with full user context (profile, apps, gamification)</w:t>
+            </w:r>
+          </w:p>
+        </w:tc>
+      </w:tr>
+      <w:tr>
+        <w:tc>
+          <w:tcPr>
+            <w:tcW w:type="dxa" w:w="3200"/>
+            <w:tcBorders>
+              <w:top w:val="single" w:color="E2E8F0" w:sz="1"/>
+              <w:left w:val="single" w:color="E2E8F0" w:sz="1"/>
+              <w:bottom w:val="single" w:color="E2E8F0" w:sz="1"/>
+              <w:right w:val="single" w:color="E2E8F0" w:sz="1"/>
+            </w:tcBorders>
+            <w:tcMar>
+              <w:top w:type="dxa" w:w="60"/>
+              <w:left w:type="dxa" w:w="100"/>
+              <w:bottom w:type="dxa" w:w="60"/>
+              <w:right w:type="dxa" w:w="100"/>
+            </w:tcMar>
+          </w:tcPr>
+          <w:p>
+            <w:r>
+              <w:rPr>
+                <w:rFonts w:ascii="Arial" w:cs="Arial" w:eastAsia="Arial" w:hAnsi="Arial"/>
+                <w:b/>
+                <w:bCs/>
+                <w:color w:val="1E293B"/>
+                <w:sz w:val="21"/>
+                <w:szCs w:val="21"/>
+              </w:rPr>
+              <w:t xml:space="preserve">Offer Comparison</w:t>
+            </w:r>
+          </w:p>
+        </w:tc>
+        <w:tc>
+          <w:tcPr>
+            <w:tcW w:type="dxa" w:w="6160"/>
+            <w:tcBorders>
+              <w:top w:val="single" w:color="E2E8F0" w:sz="1"/>
+              <w:left w:val="single" w:color="E2E8F0" w:sz="1"/>
+              <w:bottom w:val="single" w:color="E2E8F0" w:sz="1"/>
+              <w:right w:val="single" w:color="E2E8F0" w:sz="1"/>
+            </w:tcBorders>
+            <w:tcMar>
+              <w:top w:type="dxa" w:w="60"/>
+              <w:left w:type="dxa" w:w="100"/>
+              <w:bottom w:type="dxa" w:w="60"/>
+              <w:right w:type="dxa" w:w="100"/>
+            </w:tcMar>
+          </w:tcPr>
+          <w:p>
+            <w:r>
+              <w:rPr>
+                <w:rFonts w:ascii="Arial" w:cs="Arial" w:eastAsia="Arial" w:hAnsi="Arial"/>
+                <w:color w:val="64748B"/>
+                <w:sz w:val="21"/>
+                <w:szCs w:val="21"/>
+              </w:rPr>
+              <w:t xml:space="preserve">Side-by-side offers with AI scoring: compensation, benefits, growth, work-life</w:t>
             </w:r>
           </w:p>
         </w:tc>
@@ -3495,7 +3542,7 @@
                 <w:sz w:val="21"/>
                 <w:szCs w:val="21"/>
               </w:rPr>
-              <w:t xml:space="preserve">Earn XP for every action. Level up every 200 XP with animated progress bars</w:t>
+              <w:t xml:space="preserve">Earn XP for every action. Level up every 200 XP</w:t>
             </w:r>
           </w:p>
         </w:tc>
@@ -3555,7 +3602,7 @@
                 <w:sz w:val="21"/>
                 <w:szCs w:val="21"/>
               </w:rPr>
-              <w:t xml:space="preserve">Daily application streaks with longest streak tracking and risk alerts</w:t>
+              <w:t xml:space="preserve">Daily application streaks with alerts when at risk</w:t>
             </w:r>
           </w:p>
         </w:tc>
@@ -3615,7 +3662,7 @@
                 <w:sz w:val="21"/>
                 <w:szCs w:val="21"/>
               </w:rPr>
-              <w:t xml:space="preserve">From "First Steps" (1 app) to "Unstoppable" (30-day streak) with confetti celebrations</w:t>
+              <w:t xml:space="preserve">From "First Steps" to "Unstoppable" (30-day streak) with confetti</w:t>
             </w:r>
           </w:p>
         </w:tc>
@@ -3675,7 +3722,7 @@
                 <w:sz w:val="21"/>
                 <w:szCs w:val="21"/>
               </w:rPr>
-              <w:t xml:space="preserve">Anonymous XP rankings to drive competition among job seekers</w:t>
+              <w:t xml:space="preserve">Anonymous XP rankings</w:t>
             </w:r>
           </w:p>
         </w:tc>
@@ -3735,7 +3782,7 @@
                 <w:sz w:val="21"/>
                 <w:szCs w:val="21"/>
               </w:rPr>
-              <w:t xml:space="preserve">Beautiful stats cards shareable on LinkedIn and Twitter with one click</w:t>
+              <w:t xml:space="preserve">Stats cards for LinkedIn/Twitter with one click</w:t>
             </w:r>
           </w:p>
         </w:tc>
@@ -3795,7 +3842,7 @@
                 <w:sz w:val="21"/>
                 <w:szCs w:val="21"/>
               </w:rPr>
-              <w:t xml:space="preserve">Invite friends for free credits with trackable referral links</w:t>
+              <w:t xml:space="preserve">Invite friends for free credits</w:t>
             </w:r>
           </w:p>
         </w:tc>
@@ -3855,7 +3902,187 @@
                 <w:sz w:val="21"/>
                 <w:szCs w:val="21"/>
               </w:rPr>
-              <w:t xml:space="preserve">AI-powered nudges: follow-up alerts, streak warnings, contact reminders, inactivity alerts</w:t>
+              <w:t xml:space="preserve">Follow-up nudges, streak warnings, contact reminders, inactivity alerts</w:t>
+            </w:r>
+          </w:p>
+        </w:tc>
+      </w:tr>
+      <w:tr>
+        <w:tc>
+          <w:tcPr>
+            <w:tcW w:type="dxa" w:w="3200"/>
+            <w:tcBorders>
+              <w:top w:val="single" w:color="E2E8F0" w:sz="1"/>
+              <w:left w:val="single" w:color="E2E8F0" w:sz="1"/>
+              <w:bottom w:val="single" w:color="E2E8F0" w:sz="1"/>
+              <w:right w:val="single" w:color="E2E8F0" w:sz="1"/>
+            </w:tcBorders>
+            <w:tcMar>
+              <w:top w:type="dxa" w:w="60"/>
+              <w:left w:type="dxa" w:w="100"/>
+              <w:bottom w:type="dxa" w:w="60"/>
+              <w:right w:type="dxa" w:w="100"/>
+            </w:tcMar>
+          </w:tcPr>
+          <w:p>
+            <w:r>
+              <w:rPr>
+                <w:rFonts w:ascii="Arial" w:cs="Arial" w:eastAsia="Arial" w:hAnsi="Arial"/>
+                <w:b/>
+                <w:bCs/>
+                <w:color w:val="1E293B"/>
+                <w:sz w:val="21"/>
+                <w:szCs w:val="21"/>
+              </w:rPr>
+              <w:t xml:space="preserve">Product Tour</w:t>
+            </w:r>
+          </w:p>
+        </w:tc>
+        <w:tc>
+          <w:tcPr>
+            <w:tcW w:type="dxa" w:w="6160"/>
+            <w:tcBorders>
+              <w:top w:val="single" w:color="E2E8F0" w:sz="1"/>
+              <w:left w:val="single" w:color="E2E8F0" w:sz="1"/>
+              <w:bottom w:val="single" w:color="E2E8F0" w:sz="1"/>
+              <w:right w:val="single" w:color="E2E8F0" w:sz="1"/>
+            </w:tcBorders>
+            <w:tcMar>
+              <w:top w:type="dxa" w:w="60"/>
+              <w:left w:type="dxa" w:w="100"/>
+              <w:bottom w:type="dxa" w:w="60"/>
+              <w:right w:type="dxa" w:w="100"/>
+            </w:tcMar>
+          </w:tcPr>
+          <w:p>
+            <w:r>
+              <w:rPr>
+                <w:rFonts w:ascii="Arial" w:cs="Arial" w:eastAsia="Arial" w:hAnsi="Arial"/>
+                <w:color w:val="64748B"/>
+                <w:sz w:val="21"/>
+                <w:szCs w:val="21"/>
+              </w:rPr>
+              <w:t xml:space="preserve">8-step walkthrough for new users</w:t>
+            </w:r>
+          </w:p>
+        </w:tc>
+      </w:tr>
+      <w:tr>
+        <w:tc>
+          <w:tcPr>
+            <w:tcW w:type="dxa" w:w="3200"/>
+            <w:tcBorders>
+              <w:top w:val="single" w:color="E2E8F0" w:sz="1"/>
+              <w:left w:val="single" w:color="E2E8F0" w:sz="1"/>
+              <w:bottom w:val="single" w:color="E2E8F0" w:sz="1"/>
+              <w:right w:val="single" w:color="E2E8F0" w:sz="1"/>
+            </w:tcBorders>
+            <w:tcMar>
+              <w:top w:type="dxa" w:w="60"/>
+              <w:left w:type="dxa" w:w="100"/>
+              <w:bottom w:type="dxa" w:w="60"/>
+              <w:right w:type="dxa" w:w="100"/>
+            </w:tcMar>
+          </w:tcPr>
+          <w:p>
+            <w:r>
+              <w:rPr>
+                <w:rFonts w:ascii="Arial" w:cs="Arial" w:eastAsia="Arial" w:hAnsi="Arial"/>
+                <w:b/>
+                <w:bCs/>
+                <w:color w:val="1E293B"/>
+                <w:sz w:val="21"/>
+                <w:szCs w:val="21"/>
+              </w:rPr>
+              <w:t xml:space="preserve">What’s New Popup</w:t>
+            </w:r>
+          </w:p>
+        </w:tc>
+        <w:tc>
+          <w:tcPr>
+            <w:tcW w:type="dxa" w:w="6160"/>
+            <w:tcBorders>
+              <w:top w:val="single" w:color="E2E8F0" w:sz="1"/>
+              <w:left w:val="single" w:color="E2E8F0" w:sz="1"/>
+              <w:bottom w:val="single" w:color="E2E8F0" w:sz="1"/>
+              <w:right w:val="single" w:color="E2E8F0" w:sz="1"/>
+            </w:tcBorders>
+            <w:tcMar>
+              <w:top w:type="dxa" w:w="60"/>
+              <w:left w:type="dxa" w:w="100"/>
+              <w:bottom w:type="dxa" w:w="60"/>
+              <w:right w:type="dxa" w:w="100"/>
+            </w:tcMar>
+          </w:tcPr>
+          <w:p>
+            <w:r>
+              <w:rPr>
+                <w:rFonts w:ascii="Arial" w:cs="Arial" w:eastAsia="Arial" w:hAnsi="Arial"/>
+                <w:color w:val="64748B"/>
+                <w:sz w:val="21"/>
+                <w:szCs w:val="21"/>
+              </w:rPr>
+              <w:t xml:space="preserve">Shows latest features to returning users</w:t>
+            </w:r>
+          </w:p>
+        </w:tc>
+      </w:tr>
+      <w:tr>
+        <w:tc>
+          <w:tcPr>
+            <w:tcW w:type="dxa" w:w="3200"/>
+            <w:tcBorders>
+              <w:top w:val="single" w:color="E2E8F0" w:sz="1"/>
+              <w:left w:val="single" w:color="E2E8F0" w:sz="1"/>
+              <w:bottom w:val="single" w:color="E2E8F0" w:sz="1"/>
+              <w:right w:val="single" w:color="E2E8F0" w:sz="1"/>
+            </w:tcBorders>
+            <w:tcMar>
+              <w:top w:type="dxa" w:w="60"/>
+              <w:left w:type="dxa" w:w="100"/>
+              <w:bottom w:type="dxa" w:w="60"/>
+              <w:right w:type="dxa" w:w="100"/>
+            </w:tcMar>
+          </w:tcPr>
+          <w:p>
+            <w:r>
+              <w:rPr>
+                <w:rFonts w:ascii="Arial" w:cs="Arial" w:eastAsia="Arial" w:hAnsi="Arial"/>
+                <w:b/>
+                <w:bCs/>
+                <w:color w:val="1E293B"/>
+                <w:sz w:val="21"/>
+                <w:szCs w:val="21"/>
+              </w:rPr>
+              <w:t xml:space="preserve">Onboarding Checklist</w:t>
+            </w:r>
+          </w:p>
+        </w:tc>
+        <w:tc>
+          <w:tcPr>
+            <w:tcW w:type="dxa" w:w="6160"/>
+            <w:tcBorders>
+              <w:top w:val="single" w:color="E2E8F0" w:sz="1"/>
+              <w:left w:val="single" w:color="E2E8F0" w:sz="1"/>
+              <w:bottom w:val="single" w:color="E2E8F0" w:sz="1"/>
+              <w:right w:val="single" w:color="E2E8F0" w:sz="1"/>
+            </w:tcBorders>
+            <w:tcMar>
+              <w:top w:type="dxa" w:w="60"/>
+              <w:left w:type="dxa" w:w="100"/>
+              <w:bottom w:type="dxa" w:w="60"/>
+              <w:right w:type="dxa" w:w="100"/>
+            </w:tcMar>
+          </w:tcPr>
+          <w:p>
+            <w:r>
+              <w:rPr>
+                <w:rFonts w:ascii="Arial" w:cs="Arial" w:eastAsia="Arial" w:hAnsi="Arial"/>
+                <w:color w:val="64748B"/>
+                <w:sz w:val="21"/>
+                <w:szCs w:val="21"/>
+              </w:rPr>
+              <w:t xml:space="preserve">Persistent widget: profile, resume, job, first application</w:t>
             </w:r>
           </w:p>
         </w:tc>
@@ -3983,7 +4210,7 @@
                 <w:sz w:val="21"/>
                 <w:szCs w:val="21"/>
               </w:rPr>
-              <w:t xml:space="preserve">Create teams for recruiters, career coaches, and bootcamps</w:t>
+              <w:t xml:space="preserve">Create teams for recruiters, coaches, bootcamps</w:t>
             </w:r>
           </w:p>
         </w:tc>
@@ -4043,7 +4270,7 @@
                 <w:sz w:val="21"/>
                 <w:szCs w:val="21"/>
               </w:rPr>
-              <w:t xml:space="preserve">Owner, Admin, Member roles with permission-based management</w:t>
+              <w:t xml:space="preserve">Owner, Admin, Member with permission management</w:t>
             </w:r>
           </w:p>
         </w:tc>
@@ -4103,7 +4330,7 @@
                 <w:sz w:val="21"/>
                 <w:szCs w:val="21"/>
               </w:rPr>
-              <w:t xml:space="preserve">Invite team members via email with role assignment</w:t>
+              <w:t xml:space="preserve">Invite via email with role assignment</w:t>
             </w:r>
           </w:p>
         </w:tc>
@@ -4163,67 +4390,7 @@
                 <w:sz w:val="21"/>
                 <w:szCs w:val="21"/>
               </w:rPr>
-              <w:t xml:space="preserve">Aggregated stats: total applications, interviews, and offers per member</w:t>
-            </w:r>
-          </w:p>
-        </w:tc>
-      </w:tr>
-      <w:tr>
-        <w:tc>
-          <w:tcPr>
-            <w:tcW w:type="dxa" w:w="3200"/>
-            <w:tcBorders>
-              <w:top w:val="single" w:color="E2E8F0" w:sz="1"/>
-              <w:left w:val="single" w:color="E2E8F0" w:sz="1"/>
-              <w:bottom w:val="single" w:color="E2E8F0" w:sz="1"/>
-              <w:right w:val="single" w:color="E2E8F0" w:sz="1"/>
-            </w:tcBorders>
-            <w:tcMar>
-              <w:top w:type="dxa" w:w="60"/>
-              <w:left w:type="dxa" w:w="100"/>
-              <w:bottom w:type="dxa" w:w="60"/>
-              <w:right w:type="dxa" w:w="100"/>
-            </w:tcMar>
-          </w:tcPr>
-          <w:p>
-            <w:r>
-              <w:rPr>
-                <w:rFonts w:ascii="Arial" w:cs="Arial" w:eastAsia="Arial" w:hAnsi="Arial"/>
-                <w:b/>
-                <w:bCs/>
-                <w:color w:val="1E293B"/>
-                <w:sz w:val="21"/>
-                <w:szCs w:val="21"/>
-              </w:rPr>
-              <w:t xml:space="preserve">Member Tracking</w:t>
-            </w:r>
-          </w:p>
-        </w:tc>
-        <w:tc>
-          <w:tcPr>
-            <w:tcW w:type="dxa" w:w="6160"/>
-            <w:tcBorders>
-              <w:top w:val="single" w:color="E2E8F0" w:sz="1"/>
-              <w:left w:val="single" w:color="E2E8F0" w:sz="1"/>
-              <w:bottom w:val="single" w:color="E2E8F0" w:sz="1"/>
-              <w:right w:val="single" w:color="E2E8F0" w:sz="1"/>
-            </w:tcBorders>
-            <w:tcMar>
-              <w:top w:type="dxa" w:w="60"/>
-              <w:left w:type="dxa" w:w="100"/>
-              <w:bottom w:type="dxa" w:w="60"/>
-              <w:right w:type="dxa" w:w="100"/>
-            </w:tcMar>
-          </w:tcPr>
-          <w:p>
-            <w:r>
-              <w:rPr>
-                <w:rFonts w:ascii="Arial" w:cs="Arial" w:eastAsia="Arial" w:hAnsi="Arial"/>
-                <w:color w:val="64748B"/>
-                <w:sz w:val="21"/>
-                <w:szCs w:val="21"/>
-              </w:rPr>
-              <w:t xml:space="preserve">Monitor individual candidate progress across all stages</w:t>
+              <w:t xml:space="preserve">Aggregated stats per member: applications, interviews, offers</w:t>
             </w:r>
           </w:p>
         </w:tc>
@@ -4248,7 +4415,7 @@
           <w:sz w:val="36"/>
           <w:szCs w:val="36"/>
         </w:rPr>
-        <w:t xml:space="preserve">Analytics &amp; Insights</w:t>
+        <w:t xml:space="preserve">Advanced Analytics</w:t>
       </w:r>
     </w:p>
     <w:tbl>
@@ -4296,7 +4463,7 @@
                 <w:sz w:val="22"/>
                 <w:szCs w:val="22"/>
               </w:rPr>
-              <w:t xml:space="preserve">Advanced Analytics</w:t>
+              <w:t xml:space="preserve">Data &amp; Insights</w:t>
             </w:r>
           </w:p>
         </w:tc>
@@ -4356,7 +4523,7 @@
                 <w:sz w:val="21"/>
                 <w:szCs w:val="21"/>
               </w:rPr>
-              <w:t xml:space="preserve">Track what percentage of applications get responses</w:t>
+              <w:t xml:space="preserve">% of applications that get responses</w:t>
             </w:r>
           </w:p>
         </w:tc>
@@ -4416,7 +4583,7 @@
                 <w:sz w:val="21"/>
                 <w:szCs w:val="21"/>
               </w:rPr>
-              <w:t xml:space="preserve">Average days between application and recruiter response</w:t>
+              <w:t xml:space="preserve">Days between application and recruiter response</w:t>
             </w:r>
           </w:p>
         </w:tc>
@@ -4476,7 +4643,7 @@
                 <w:sz w:val="21"/>
                 <w:szCs w:val="21"/>
               </w:rPr>
-              <w:t xml:space="preserve">Data-driven analysis of which day of the week gets most responses</w:t>
+              <w:t xml:space="preserve">Data-driven analysis of which weekday gets most responses</w:t>
             </w:r>
           </w:p>
         </w:tc>
@@ -4536,7 +4703,7 @@
                 <w:sz w:val="21"/>
                 <w:szCs w:val="21"/>
               </w:rPr>
-              <w:t xml:space="preserve">Visual funnel: Saved → Applied → Interview → Offer with percentages</w:t>
+              <w:t xml:space="preserve">Saved → Applied → Interview → Offer with %</w:t>
             </w:r>
           </w:p>
         </w:tc>
@@ -4596,7 +4763,7 @@
                 <w:sz w:val="21"/>
                 <w:szCs w:val="21"/>
               </w:rPr>
-              <w:t xml:space="preserve">Line chart showing application volume over last 6 months</w:t>
+              <w:t xml:space="preserve">Line chart of application volume over 6 months</w:t>
             </w:r>
           </w:p>
         </w:tc>
@@ -4656,67 +4823,67 @@
                 <w:sz w:val="21"/>
                 <w:szCs w:val="21"/>
               </w:rPr>
-              <w:t xml:space="preserve">Breakdown by source (hh.ru, staff.am, manual) with interview/offer rates</w:t>
-            </w:r>
-          </w:p>
-        </w:tc>
-      </w:tr>
-      <w:tr>
-        <w:tc>
-          <w:tcPr>
-            <w:tcW w:type="dxa" w:w="3200"/>
-            <w:tcBorders>
-              <w:top w:val="single" w:color="E2E8F0" w:sz="1"/>
-              <w:left w:val="single" w:color="E2E8F0" w:sz="1"/>
-              <w:bottom w:val="single" w:color="E2E8F0" w:sz="1"/>
-              <w:right w:val="single" w:color="E2E8F0" w:sz="1"/>
-            </w:tcBorders>
-            <w:tcMar>
-              <w:top w:type="dxa" w:w="60"/>
-              <w:left w:type="dxa" w:w="100"/>
-              <w:bottom w:type="dxa" w:w="60"/>
-              <w:right w:type="dxa" w:w="100"/>
-            </w:tcMar>
-          </w:tcPr>
-          <w:p>
-            <w:r>
-              <w:rPr>
-                <w:rFonts w:ascii="Arial" w:cs="Arial" w:eastAsia="Arial" w:hAnsi="Arial"/>
-                <w:b/>
-                <w:bCs/>
-                <w:color w:val="1E293B"/>
-                <w:sz w:val="21"/>
-                <w:szCs w:val="21"/>
-              </w:rPr>
-              <w:t xml:space="preserve">Response Time Distribution</w:t>
-            </w:r>
-          </w:p>
-        </w:tc>
-        <w:tc>
-          <w:tcPr>
-            <w:tcW w:type="dxa" w:w="6160"/>
-            <w:tcBorders>
-              <w:top w:val="single" w:color="E2E8F0" w:sz="1"/>
-              <w:left w:val="single" w:color="E2E8F0" w:sz="1"/>
-              <w:bottom w:val="single" w:color="E2E8F0" w:sz="1"/>
-              <w:right w:val="single" w:color="E2E8F0" w:sz="1"/>
-            </w:tcBorders>
-            <w:tcMar>
-              <w:top w:type="dxa" w:w="60"/>
-              <w:left w:type="dxa" w:w="100"/>
-              <w:bottom w:type="dxa" w:w="60"/>
-              <w:right w:type="dxa" w:w="100"/>
-            </w:tcMar>
-          </w:tcPr>
-          <w:p>
-            <w:r>
-              <w:rPr>
-                <w:rFonts w:ascii="Arial" w:cs="Arial" w:eastAsia="Arial" w:hAnsi="Arial"/>
-                <w:color w:val="64748B"/>
-                <w:sz w:val="21"/>
-                <w:szCs w:val="21"/>
-              </w:rPr>
-              <w:t xml:space="preserve">Histogram showing how fast companies respond (&lt; 3d, 3-7d, 1-2w, etc.)</w:t>
+              <w:t xml:space="preserve">Breakdown by hh.ru/staff.am/manual with interview/offer rates</w:t>
+            </w:r>
+          </w:p>
+        </w:tc>
+      </w:tr>
+      <w:tr>
+        <w:tc>
+          <w:tcPr>
+            <w:tcW w:type="dxa" w:w="3200"/>
+            <w:tcBorders>
+              <w:top w:val="single" w:color="E2E8F0" w:sz="1"/>
+              <w:left w:val="single" w:color="E2E8F0" w:sz="1"/>
+              <w:bottom w:val="single" w:color="E2E8F0" w:sz="1"/>
+              <w:right w:val="single" w:color="E2E8F0" w:sz="1"/>
+            </w:tcBorders>
+            <w:tcMar>
+              <w:top w:type="dxa" w:w="60"/>
+              <w:left w:type="dxa" w:w="100"/>
+              <w:bottom w:type="dxa" w:w="60"/>
+              <w:right w:type="dxa" w:w="100"/>
+            </w:tcMar>
+          </w:tcPr>
+          <w:p>
+            <w:r>
+              <w:rPr>
+                <w:rFonts w:ascii="Arial" w:cs="Arial" w:eastAsia="Arial" w:hAnsi="Arial"/>
+                <w:b/>
+                <w:bCs/>
+                <w:color w:val="1E293B"/>
+                <w:sz w:val="21"/>
+                <w:szCs w:val="21"/>
+              </w:rPr>
+              <w:t xml:space="preserve">Response Distribution</w:t>
+            </w:r>
+          </w:p>
+        </w:tc>
+        <w:tc>
+          <w:tcPr>
+            <w:tcW w:type="dxa" w:w="6160"/>
+            <w:tcBorders>
+              <w:top w:val="single" w:color="E2E8F0" w:sz="1"/>
+              <w:left w:val="single" w:color="E2E8F0" w:sz="1"/>
+              <w:bottom w:val="single" w:color="E2E8F0" w:sz="1"/>
+              <w:right w:val="single" w:color="E2E8F0" w:sz="1"/>
+            </w:tcBorders>
+            <w:tcMar>
+              <w:top w:type="dxa" w:w="60"/>
+              <w:left w:type="dxa" w:w="100"/>
+              <w:bottom w:type="dxa" w:w="60"/>
+              <w:right w:type="dxa" w:w="100"/>
+            </w:tcMar>
+          </w:tcPr>
+          <w:p>
+            <w:r>
+              <w:rPr>
+                <w:rFonts w:ascii="Arial" w:cs="Arial" w:eastAsia="Arial" w:hAnsi="Arial"/>
+                <w:color w:val="64748B"/>
+                <w:sz w:val="21"/>
+                <w:szCs w:val="21"/>
+              </w:rPr>
+              <w:t xml:space="preserve">Histogram: &lt; 3d, 3-7d, 1-2w, 2-4w, 1m+</w:t>
             </w:r>
           </w:p>
         </w:tc>
@@ -4776,7 +4943,7 @@
                 <w:sz w:val="21"/>
                 <w:szCs w:val="21"/>
               </w:rPr>
-              <w:t xml:space="preserve">Automated weekly summary API with stats, streak, and recent applications</w:t>
+              <w:t xml:space="preserve">Automated weekly summary API</w:t>
             </w:r>
           </w:p>
         </w:tc>
@@ -4904,7 +5071,7 @@
                 <w:sz w:val="21"/>
                 <w:szCs w:val="21"/>
               </w:rPr>
-              <w:t xml:space="preserve">CMD+K quick navigation across all 33 pages with search</w:t>
+              <w:t xml:space="preserve">CMD+K with global search across all data + page navigation</w:t>
             </w:r>
           </w:p>
         </w:tc>
@@ -4964,67 +5131,127 @@
                 <w:sz w:val="21"/>
                 <w:szCs w:val="21"/>
               </w:rPr>
-              <w:t xml:space="preserve">g+d Dashboard, g+j Jobs, g+t Tracker, g+r Resume, g+a Analytics, and more</w:t>
-            </w:r>
-          </w:p>
-        </w:tc>
-      </w:tr>
-      <w:tr>
-        <w:tc>
-          <w:tcPr>
-            <w:tcW w:type="dxa" w:w="3200"/>
-            <w:tcBorders>
-              <w:top w:val="single" w:color="E2E8F0" w:sz="1"/>
-              <w:left w:val="single" w:color="E2E8F0" w:sz="1"/>
-              <w:bottom w:val="single" w:color="E2E8F0" w:sz="1"/>
-              <w:right w:val="single" w:color="E2E8F0" w:sz="1"/>
-            </w:tcBorders>
-            <w:tcMar>
-              <w:top w:type="dxa" w:w="60"/>
-              <w:left w:type="dxa" w:w="100"/>
-              <w:bottom w:type="dxa" w:w="60"/>
-              <w:right w:type="dxa" w:w="100"/>
-            </w:tcMar>
-          </w:tcPr>
-          <w:p>
-            <w:r>
-              <w:rPr>
-                <w:rFonts w:ascii="Arial" w:cs="Arial" w:eastAsia="Arial" w:hAnsi="Arial"/>
-                <w:b/>
-                <w:bCs/>
-                <w:color w:val="1E293B"/>
-                <w:sz w:val="21"/>
-                <w:szCs w:val="21"/>
-              </w:rPr>
-              <w:t xml:space="preserve">Floating Action Button</w:t>
-            </w:r>
-          </w:p>
-        </w:tc>
-        <w:tc>
-          <w:tcPr>
-            <w:tcW w:type="dxa" w:w="6160"/>
-            <w:tcBorders>
-              <w:top w:val="single" w:color="E2E8F0" w:sz="1"/>
-              <w:left w:val="single" w:color="E2E8F0" w:sz="1"/>
-              <w:bottom w:val="single" w:color="E2E8F0" w:sz="1"/>
-              <w:right w:val="single" w:color="E2E8F0" w:sz="1"/>
-            </w:tcBorders>
-            <w:tcMar>
-              <w:top w:type="dxa" w:w="60"/>
-              <w:left w:type="dxa" w:w="100"/>
-              <w:bottom w:type="dxa" w:w="60"/>
-              <w:right w:type="dxa" w:w="100"/>
-            </w:tcMar>
-          </w:tcPr>
-          <w:p>
-            <w:r>
-              <w:rPr>
-                <w:rFonts w:ascii="Arial" w:cs="Arial" w:eastAsia="Arial" w:hAnsi="Arial"/>
-                <w:color w:val="64748B"/>
-                <w:sz w:val="21"/>
-                <w:szCs w:val="21"/>
-              </w:rPr>
-              <w:t xml:space="preserve">Quick actions: Import Job, Create Resume, Import CV, Job Agent</w:t>
+              <w:t xml:space="preserve">g+d Dashboard, g+j Jobs, g+t Tracker, g+r Resume, etc.</w:t>
+            </w:r>
+          </w:p>
+        </w:tc>
+      </w:tr>
+      <w:tr>
+        <w:tc>
+          <w:tcPr>
+            <w:tcW w:type="dxa" w:w="3200"/>
+            <w:tcBorders>
+              <w:top w:val="single" w:color="E2E8F0" w:sz="1"/>
+              <w:left w:val="single" w:color="E2E8F0" w:sz="1"/>
+              <w:bottom w:val="single" w:color="E2E8F0" w:sz="1"/>
+              <w:right w:val="single" w:color="E2E8F0" w:sz="1"/>
+            </w:tcBorders>
+            <w:tcMar>
+              <w:top w:type="dxa" w:w="60"/>
+              <w:left w:type="dxa" w:w="100"/>
+              <w:bottom w:type="dxa" w:w="60"/>
+              <w:right w:type="dxa" w:w="100"/>
+            </w:tcMar>
+          </w:tcPr>
+          <w:p>
+            <w:r>
+              <w:rPr>
+                <w:rFonts w:ascii="Arial" w:cs="Arial" w:eastAsia="Arial" w:hAnsi="Arial"/>
+                <w:b/>
+                <w:bCs/>
+                <w:color w:val="1E293B"/>
+                <w:sz w:val="21"/>
+                <w:szCs w:val="21"/>
+              </w:rPr>
+              <w:t xml:space="preserve">Breadcrumbs</w:t>
+            </w:r>
+          </w:p>
+        </w:tc>
+        <w:tc>
+          <w:tcPr>
+            <w:tcW w:type="dxa" w:w="6160"/>
+            <w:tcBorders>
+              <w:top w:val="single" w:color="E2E8F0" w:sz="1"/>
+              <w:left w:val="single" w:color="E2E8F0" w:sz="1"/>
+              <w:bottom w:val="single" w:color="E2E8F0" w:sz="1"/>
+              <w:right w:val="single" w:color="E2E8F0" w:sz="1"/>
+            </w:tcBorders>
+            <w:tcMar>
+              <w:top w:type="dxa" w:w="60"/>
+              <w:left w:type="dxa" w:w="100"/>
+              <w:bottom w:type="dxa" w:w="60"/>
+              <w:right w:type="dxa" w:w="100"/>
+            </w:tcMar>
+          </w:tcPr>
+          <w:p>
+            <w:r>
+              <w:rPr>
+                <w:rFonts w:ascii="Arial" w:cs="Arial" w:eastAsia="Arial" w:hAnsi="Arial"/>
+                <w:color w:val="64748B"/>
+                <w:sz w:val="21"/>
+                <w:szCs w:val="21"/>
+              </w:rPr>
+              <w:t xml:space="preserve">Auto-generated navigation on all pages</w:t>
+            </w:r>
+          </w:p>
+        </w:tc>
+      </w:tr>
+      <w:tr>
+        <w:tc>
+          <w:tcPr>
+            <w:tcW w:type="dxa" w:w="3200"/>
+            <w:tcBorders>
+              <w:top w:val="single" w:color="E2E8F0" w:sz="1"/>
+              <w:left w:val="single" w:color="E2E8F0" w:sz="1"/>
+              <w:bottom w:val="single" w:color="E2E8F0" w:sz="1"/>
+              <w:right w:val="single" w:color="E2E8F0" w:sz="1"/>
+            </w:tcBorders>
+            <w:tcMar>
+              <w:top w:type="dxa" w:w="60"/>
+              <w:left w:type="dxa" w:w="100"/>
+              <w:bottom w:type="dxa" w:w="60"/>
+              <w:right w:type="dxa" w:w="100"/>
+            </w:tcMar>
+          </w:tcPr>
+          <w:p>
+            <w:r>
+              <w:rPr>
+                <w:rFonts w:ascii="Arial" w:cs="Arial" w:eastAsia="Arial" w:hAnsi="Arial"/>
+                <w:b/>
+                <w:bCs/>
+                <w:color w:val="1E293B"/>
+                <w:sz w:val="21"/>
+                <w:szCs w:val="21"/>
+              </w:rPr>
+              <w:t xml:space="preserve">FAB</w:t>
+            </w:r>
+          </w:p>
+        </w:tc>
+        <w:tc>
+          <w:tcPr>
+            <w:tcW w:type="dxa" w:w="6160"/>
+            <w:tcBorders>
+              <w:top w:val="single" w:color="E2E8F0" w:sz="1"/>
+              <w:left w:val="single" w:color="E2E8F0" w:sz="1"/>
+              <w:bottom w:val="single" w:color="E2E8F0" w:sz="1"/>
+              <w:right w:val="single" w:color="E2E8F0" w:sz="1"/>
+            </w:tcBorders>
+            <w:tcMar>
+              <w:top w:type="dxa" w:w="60"/>
+              <w:left w:type="dxa" w:w="100"/>
+              <w:bottom w:type="dxa" w:w="60"/>
+              <w:right w:type="dxa" w:w="100"/>
+            </w:tcMar>
+          </w:tcPr>
+          <w:p>
+            <w:r>
+              <w:rPr>
+                <w:rFonts w:ascii="Arial" w:cs="Arial" w:eastAsia="Arial" w:hAnsi="Arial"/>
+                <w:color w:val="64748B"/>
+                <w:sz w:val="21"/>
+                <w:szCs w:val="21"/>
+              </w:rPr>
+              <w:t xml:space="preserve">Floating action button: Import Job, Create Resume, CV Import, Job Agent</w:t>
             </w:r>
           </w:p>
         </w:tc>
@@ -5084,7 +5311,7 @@
                 <w:sz w:val="21"/>
                 <w:szCs w:val="21"/>
               </w:rPr>
-              <w:t xml:space="preserve">5-tab bottom navigation for mobile (Home, Jobs, Tracker, Resume, Progress)</w:t>
+              <w:t xml:space="preserve">5-tab nav: Home, Jobs, Tracker, Resume, Progress</w:t>
             </w:r>
           </w:p>
         </w:tc>
@@ -5144,127 +5371,7 @@
                 <w:sz w:val="21"/>
                 <w:szCs w:val="21"/>
               </w:rPr>
-              <w:t xml:space="preserve">Full dark mode support across all pages including landing page</w:t>
-            </w:r>
-          </w:p>
-        </w:tc>
-      </w:tr>
-      <w:tr>
-        <w:tc>
-          <w:tcPr>
-            <w:tcW w:type="dxa" w:w="3200"/>
-            <w:tcBorders>
-              <w:top w:val="single" w:color="E2E8F0" w:sz="1"/>
-              <w:left w:val="single" w:color="E2E8F0" w:sz="1"/>
-              <w:bottom w:val="single" w:color="E2E8F0" w:sz="1"/>
-              <w:right w:val="single" w:color="E2E8F0" w:sz="1"/>
-            </w:tcBorders>
-            <w:tcMar>
-              <w:top w:type="dxa" w:w="60"/>
-              <w:left w:type="dxa" w:w="100"/>
-              <w:bottom w:type="dxa" w:w="60"/>
-              <w:right w:type="dxa" w:w="100"/>
-            </w:tcMar>
-          </w:tcPr>
-          <w:p>
-            <w:r>
-              <w:rPr>
-                <w:rFonts w:ascii="Arial" w:cs="Arial" w:eastAsia="Arial" w:hAnsi="Arial"/>
-                <w:b/>
-                <w:bCs/>
-                <w:color w:val="1E293B"/>
-                <w:sz w:val="21"/>
-                <w:szCs w:val="21"/>
-              </w:rPr>
-              <w:t xml:space="preserve">Product Tour</w:t>
-            </w:r>
-          </w:p>
-        </w:tc>
-        <w:tc>
-          <w:tcPr>
-            <w:tcW w:type="dxa" w:w="6160"/>
-            <w:tcBorders>
-              <w:top w:val="single" w:color="E2E8F0" w:sz="1"/>
-              <w:left w:val="single" w:color="E2E8F0" w:sz="1"/>
-              <w:bottom w:val="single" w:color="E2E8F0" w:sz="1"/>
-              <w:right w:val="single" w:color="E2E8F0" w:sz="1"/>
-            </w:tcBorders>
-            <w:tcMar>
-              <w:top w:type="dxa" w:w="60"/>
-              <w:left w:type="dxa" w:w="100"/>
-              <w:bottom w:type="dxa" w:w="60"/>
-              <w:right w:type="dxa" w:w="100"/>
-            </w:tcMar>
-          </w:tcPr>
-          <w:p>
-            <w:r>
-              <w:rPr>
-                <w:rFonts w:ascii="Arial" w:cs="Arial" w:eastAsia="Arial" w:hAnsi="Arial"/>
-                <w:color w:val="64748B"/>
-                <w:sz w:val="21"/>
-                <w:szCs w:val="21"/>
-              </w:rPr>
-              <w:t xml:space="preserve">8-step interactive walkthrough for new users with progress bar</w:t>
-            </w:r>
-          </w:p>
-        </w:tc>
-      </w:tr>
-      <w:tr>
-        <w:tc>
-          <w:tcPr>
-            <w:tcW w:type="dxa" w:w="3200"/>
-            <w:tcBorders>
-              <w:top w:val="single" w:color="E2E8F0" w:sz="1"/>
-              <w:left w:val="single" w:color="E2E8F0" w:sz="1"/>
-              <w:bottom w:val="single" w:color="E2E8F0" w:sz="1"/>
-              <w:right w:val="single" w:color="E2E8F0" w:sz="1"/>
-            </w:tcBorders>
-            <w:tcMar>
-              <w:top w:type="dxa" w:w="60"/>
-              <w:left w:type="dxa" w:w="100"/>
-              <w:bottom w:type="dxa" w:w="60"/>
-              <w:right w:type="dxa" w:w="100"/>
-            </w:tcMar>
-          </w:tcPr>
-          <w:p>
-            <w:r>
-              <w:rPr>
-                <w:rFonts w:ascii="Arial" w:cs="Arial" w:eastAsia="Arial" w:hAnsi="Arial"/>
-                <w:b/>
-                <w:bCs/>
-                <w:color w:val="1E293B"/>
-                <w:sz w:val="21"/>
-                <w:szCs w:val="21"/>
-              </w:rPr>
-              <w:t xml:space="preserve">What’s New Popup</w:t>
-            </w:r>
-          </w:p>
-        </w:tc>
-        <w:tc>
-          <w:tcPr>
-            <w:tcW w:type="dxa" w:w="6160"/>
-            <w:tcBorders>
-              <w:top w:val="single" w:color="E2E8F0" w:sz="1"/>
-              <w:left w:val="single" w:color="E2E8F0" w:sz="1"/>
-              <w:bottom w:val="single" w:color="E2E8F0" w:sz="1"/>
-              <w:right w:val="single" w:color="E2E8F0" w:sz="1"/>
-            </w:tcBorders>
-            <w:tcMar>
-              <w:top w:type="dxa" w:w="60"/>
-              <w:left w:type="dxa" w:w="100"/>
-              <w:bottom w:type="dxa" w:w="60"/>
-              <w:right w:type="dxa" w:w="100"/>
-            </w:tcMar>
-          </w:tcPr>
-          <w:p>
-            <w:r>
-              <w:rPr>
-                <w:rFonts w:ascii="Arial" w:cs="Arial" w:eastAsia="Arial" w:hAnsi="Arial"/>
-                <w:color w:val="64748B"/>
-                <w:sz w:val="21"/>
-                <w:szCs w:val="21"/>
-              </w:rPr>
-              <w:t xml:space="preserve">Shows latest features to returning users with changelog link</w:t>
+              <w:t xml:space="preserve">Full dark mode on all pages including landing</w:t>
             </w:r>
           </w:p>
         </w:tc>
@@ -5324,187 +5431,367 @@
                 <w:sz w:val="21"/>
                 <w:szCs w:val="21"/>
               </w:rPr>
-              <w:t xml:space="preserve">Count-up stats, gradient cards, progress rings, funnel charts, heatmaps</w:t>
-            </w:r>
-          </w:p>
-        </w:tc>
-      </w:tr>
-      <w:tr>
-        <w:tc>
-          <w:tcPr>
-            <w:tcW w:type="dxa" w:w="3200"/>
-            <w:tcBorders>
-              <w:top w:val="single" w:color="E2E8F0" w:sz="1"/>
-              <w:left w:val="single" w:color="E2E8F0" w:sz="1"/>
-              <w:bottom w:val="single" w:color="E2E8F0" w:sz="1"/>
-              <w:right w:val="single" w:color="E2E8F0" w:sz="1"/>
-            </w:tcBorders>
-            <w:tcMar>
-              <w:top w:type="dxa" w:w="60"/>
-              <w:left w:type="dxa" w:w="100"/>
-              <w:bottom w:type="dxa" w:w="60"/>
-              <w:right w:type="dxa" w:w="100"/>
-            </w:tcMar>
-          </w:tcPr>
-          <w:p>
-            <w:r>
-              <w:rPr>
-                <w:rFonts w:ascii="Arial" w:cs="Arial" w:eastAsia="Arial" w:hAnsi="Arial"/>
-                <w:b/>
-                <w:bCs/>
-                <w:color w:val="1E293B"/>
-                <w:sz w:val="21"/>
-                <w:szCs w:val="21"/>
-              </w:rPr>
-              <w:t xml:space="preserve">Confetti Effects</w:t>
-            </w:r>
-          </w:p>
-        </w:tc>
-        <w:tc>
-          <w:tcPr>
-            <w:tcW w:type="dxa" w:w="6160"/>
-            <w:tcBorders>
-              <w:top w:val="single" w:color="E2E8F0" w:sz="1"/>
-              <w:left w:val="single" w:color="E2E8F0" w:sz="1"/>
-              <w:bottom w:val="single" w:color="E2E8F0" w:sz="1"/>
-              <w:right w:val="single" w:color="E2E8F0" w:sz="1"/>
-            </w:tcBorders>
-            <w:tcMar>
-              <w:top w:type="dxa" w:w="60"/>
-              <w:left w:type="dxa" w:w="100"/>
-              <w:bottom w:type="dxa" w:w="60"/>
-              <w:right w:type="dxa" w:w="100"/>
-            </w:tcMar>
-          </w:tcPr>
-          <w:p>
-            <w:r>
-              <w:rPr>
-                <w:rFonts w:ascii="Arial" w:cs="Arial" w:eastAsia="Arial" w:hAnsi="Arial"/>
-                <w:color w:val="64748B"/>
-                <w:sz w:val="21"/>
-                <w:szCs w:val="21"/>
-              </w:rPr>
-              <w:t xml:space="preserve">Celebration animations on achievement unlocks</w:t>
-            </w:r>
-          </w:p>
-        </w:tc>
-      </w:tr>
-      <w:tr>
-        <w:tc>
-          <w:tcPr>
-            <w:tcW w:type="dxa" w:w="3200"/>
-            <w:tcBorders>
-              <w:top w:val="single" w:color="E2E8F0" w:sz="1"/>
-              <w:left w:val="single" w:color="E2E8F0" w:sz="1"/>
-              <w:bottom w:val="single" w:color="E2E8F0" w:sz="1"/>
-              <w:right w:val="single" w:color="E2E8F0" w:sz="1"/>
-            </w:tcBorders>
-            <w:tcMar>
-              <w:top w:type="dxa" w:w="60"/>
-              <w:left w:type="dxa" w:w="100"/>
-              <w:bottom w:type="dxa" w:w="60"/>
-              <w:right w:type="dxa" w:w="100"/>
-            </w:tcMar>
-          </w:tcPr>
-          <w:p>
-            <w:r>
-              <w:rPr>
-                <w:rFonts w:ascii="Arial" w:cs="Arial" w:eastAsia="Arial" w:hAnsi="Arial"/>
-                <w:b/>
-                <w:bCs/>
-                <w:color w:val="1E293B"/>
-                <w:sz w:val="21"/>
-                <w:szCs w:val="21"/>
-              </w:rPr>
-              <w:t xml:space="preserve">Onboarding Checklist</w:t>
-            </w:r>
-          </w:p>
-        </w:tc>
-        <w:tc>
-          <w:tcPr>
-            <w:tcW w:type="dxa" w:w="6160"/>
-            <w:tcBorders>
-              <w:top w:val="single" w:color="E2E8F0" w:sz="1"/>
-              <w:left w:val="single" w:color="E2E8F0" w:sz="1"/>
-              <w:bottom w:val="single" w:color="E2E8F0" w:sz="1"/>
-              <w:right w:val="single" w:color="E2E8F0" w:sz="1"/>
-            </w:tcBorders>
-            <w:tcMar>
-              <w:top w:type="dxa" w:w="60"/>
-              <w:left w:type="dxa" w:w="100"/>
-              <w:bottom w:type="dxa" w:w="60"/>
-              <w:right w:type="dxa" w:w="100"/>
-            </w:tcMar>
-          </w:tcPr>
-          <w:p>
-            <w:r>
-              <w:rPr>
-                <w:rFonts w:ascii="Arial" w:cs="Arial" w:eastAsia="Arial" w:hAnsi="Arial"/>
-                <w:color w:val="64748B"/>
-                <w:sz w:val="21"/>
-                <w:szCs w:val="21"/>
-              </w:rPr>
-              <w:t xml:space="preserve">Persistent widget tracking profile, resume, job, and first application</w:t>
-            </w:r>
-          </w:p>
-        </w:tc>
-      </w:tr>
-      <w:tr>
-        <w:tc>
-          <w:tcPr>
-            <w:tcW w:type="dxa" w:w="3200"/>
-            <w:tcBorders>
-              <w:top w:val="single" w:color="E2E8F0" w:sz="1"/>
-              <w:left w:val="single" w:color="E2E8F0" w:sz="1"/>
-              <w:bottom w:val="single" w:color="E2E8F0" w:sz="1"/>
-              <w:right w:val="single" w:color="E2E8F0" w:sz="1"/>
-            </w:tcBorders>
-            <w:tcMar>
-              <w:top w:type="dxa" w:w="60"/>
-              <w:left w:type="dxa" w:w="100"/>
-              <w:bottom w:type="dxa" w:w="60"/>
-              <w:right w:type="dxa" w:w="100"/>
-            </w:tcMar>
-          </w:tcPr>
-          <w:p>
-            <w:r>
-              <w:rPr>
-                <w:rFonts w:ascii="Arial" w:cs="Arial" w:eastAsia="Arial" w:hAnsi="Arial"/>
-                <w:b/>
-                <w:bCs/>
-                <w:color w:val="1E293B"/>
-                <w:sz w:val="21"/>
-                <w:szCs w:val="21"/>
-              </w:rPr>
-              <w:t xml:space="preserve">Smart Reminders</w:t>
-            </w:r>
-          </w:p>
-        </w:tc>
-        <w:tc>
-          <w:tcPr>
-            <w:tcW w:type="dxa" w:w="6160"/>
-            <w:tcBorders>
-              <w:top w:val="single" w:color="E2E8F0" w:sz="1"/>
-              <w:left w:val="single" w:color="E2E8F0" w:sz="1"/>
-              <w:bottom w:val="single" w:color="E2E8F0" w:sz="1"/>
-              <w:right w:val="single" w:color="E2E8F0" w:sz="1"/>
-            </w:tcBorders>
-            <w:tcMar>
-              <w:top w:type="dxa" w:w="60"/>
-              <w:left w:type="dxa" w:w="100"/>
-              <w:bottom w:type="dxa" w:w="60"/>
-              <w:right w:type="dxa" w:w="100"/>
-            </w:tcMar>
-          </w:tcPr>
-          <w:p>
-            <w:r>
-              <w:rPr>
-                <w:rFonts w:ascii="Arial" w:cs="Arial" w:eastAsia="Arial" w:hAnsi="Arial"/>
-                <w:color w:val="64748B"/>
-                <w:sz w:val="21"/>
-                <w:szCs w:val="21"/>
-              </w:rPr>
-              <w:t xml:space="preserve">Live feed of actionable reminders on dashboard</w:t>
+              <w:t xml:space="preserve">Count-up stats, gradient cards, progress rings, heatmaps, funnel charts</w:t>
+            </w:r>
+          </w:p>
+        </w:tc>
+      </w:tr>
+      <w:tr>
+        <w:tc>
+          <w:tcPr>
+            <w:tcW w:type="dxa" w:w="3200"/>
+            <w:tcBorders>
+              <w:top w:val="single" w:color="E2E8F0" w:sz="1"/>
+              <w:left w:val="single" w:color="E2E8F0" w:sz="1"/>
+              <w:bottom w:val="single" w:color="E2E8F0" w:sz="1"/>
+              <w:right w:val="single" w:color="E2E8F0" w:sz="1"/>
+            </w:tcBorders>
+            <w:tcMar>
+              <w:top w:type="dxa" w:w="60"/>
+              <w:left w:type="dxa" w:w="100"/>
+              <w:bottom w:type="dxa" w:w="60"/>
+              <w:right w:type="dxa" w:w="100"/>
+            </w:tcMar>
+          </w:tcPr>
+          <w:p>
+            <w:r>
+              <w:rPr>
+                <w:rFonts w:ascii="Arial" w:cs="Arial" w:eastAsia="Arial" w:hAnsi="Arial"/>
+                <w:b/>
+                <w:bCs/>
+                <w:color w:val="1E293B"/>
+                <w:sz w:val="21"/>
+                <w:szCs w:val="21"/>
+              </w:rPr>
+              <w:t xml:space="preserve">Confetti</w:t>
+            </w:r>
+          </w:p>
+        </w:tc>
+        <w:tc>
+          <w:tcPr>
+            <w:tcW w:type="dxa" w:w="6160"/>
+            <w:tcBorders>
+              <w:top w:val="single" w:color="E2E8F0" w:sz="1"/>
+              <w:left w:val="single" w:color="E2E8F0" w:sz="1"/>
+              <w:bottom w:val="single" w:color="E2E8F0" w:sz="1"/>
+              <w:right w:val="single" w:color="E2E8F0" w:sz="1"/>
+            </w:tcBorders>
+            <w:tcMar>
+              <w:top w:type="dxa" w:w="60"/>
+              <w:left w:type="dxa" w:w="100"/>
+              <w:bottom w:type="dxa" w:w="60"/>
+              <w:right w:type="dxa" w:w="100"/>
+            </w:tcMar>
+          </w:tcPr>
+          <w:p>
+            <w:r>
+              <w:rPr>
+                <w:rFonts w:ascii="Arial" w:cs="Arial" w:eastAsia="Arial" w:hAnsi="Arial"/>
+                <w:color w:val="64748B"/>
+                <w:sz w:val="21"/>
+                <w:szCs w:val="21"/>
+              </w:rPr>
+              <w:t xml:space="preserve">Celebration on achievement unlocks</w:t>
+            </w:r>
+          </w:p>
+        </w:tc>
+      </w:tr>
+      <w:tr>
+        <w:tc>
+          <w:tcPr>
+            <w:tcW w:type="dxa" w:w="3200"/>
+            <w:tcBorders>
+              <w:top w:val="single" w:color="E2E8F0" w:sz="1"/>
+              <w:left w:val="single" w:color="E2E8F0" w:sz="1"/>
+              <w:bottom w:val="single" w:color="E2E8F0" w:sz="1"/>
+              <w:right w:val="single" w:color="E2E8F0" w:sz="1"/>
+            </w:tcBorders>
+            <w:tcMar>
+              <w:top w:type="dxa" w:w="60"/>
+              <w:left w:type="dxa" w:w="100"/>
+              <w:bottom w:type="dxa" w:w="60"/>
+              <w:right w:type="dxa" w:w="100"/>
+            </w:tcMar>
+          </w:tcPr>
+          <w:p>
+            <w:r>
+              <w:rPr>
+                <w:rFonts w:ascii="Arial" w:cs="Arial" w:eastAsia="Arial" w:hAnsi="Arial"/>
+                <w:b/>
+                <w:bCs/>
+                <w:color w:val="1E293B"/>
+                <w:sz w:val="21"/>
+                <w:szCs w:val="21"/>
+              </w:rPr>
+              <w:t xml:space="preserve">Typing Animation</w:t>
+            </w:r>
+          </w:p>
+        </w:tc>
+        <w:tc>
+          <w:tcPr>
+            <w:tcW w:type="dxa" w:w="6160"/>
+            <w:tcBorders>
+              <w:top w:val="single" w:color="E2E8F0" w:sz="1"/>
+              <w:left w:val="single" w:color="E2E8F0" w:sz="1"/>
+              <w:bottom w:val="single" w:color="E2E8F0" w:sz="1"/>
+              <w:right w:val="single" w:color="E2E8F0" w:sz="1"/>
+            </w:tcBorders>
+            <w:tcMar>
+              <w:top w:type="dxa" w:w="60"/>
+              <w:left w:type="dxa" w:w="100"/>
+              <w:bottom w:type="dxa" w:w="60"/>
+              <w:right w:type="dxa" w:w="100"/>
+            </w:tcMar>
+          </w:tcPr>
+          <w:p>
+            <w:r>
+              <w:rPr>
+                <w:rFonts w:ascii="Arial" w:cs="Arial" w:eastAsia="Arial" w:hAnsi="Arial"/>
+                <w:color w:val="64748B"/>
+                <w:sz w:val="21"/>
+                <w:szCs w:val="21"/>
+              </w:rPr>
+              <w:t xml:space="preserve">Animated hero text on landing page</w:t>
+            </w:r>
+          </w:p>
+        </w:tc>
+      </w:tr>
+      <w:tr>
+        <w:tc>
+          <w:tcPr>
+            <w:tcW w:type="dxa" w:w="3200"/>
+            <w:tcBorders>
+              <w:top w:val="single" w:color="E2E8F0" w:sz="1"/>
+              <w:left w:val="single" w:color="E2E8F0" w:sz="1"/>
+              <w:bottom w:val="single" w:color="E2E8F0" w:sz="1"/>
+              <w:right w:val="single" w:color="E2E8F0" w:sz="1"/>
+            </w:tcBorders>
+            <w:tcMar>
+              <w:top w:type="dxa" w:w="60"/>
+              <w:left w:type="dxa" w:w="100"/>
+              <w:bottom w:type="dxa" w:w="60"/>
+              <w:right w:type="dxa" w:w="100"/>
+            </w:tcMar>
+          </w:tcPr>
+          <w:p>
+            <w:r>
+              <w:rPr>
+                <w:rFonts w:ascii="Arial" w:cs="Arial" w:eastAsia="Arial" w:hAnsi="Arial"/>
+                <w:b/>
+                <w:bCs/>
+                <w:color w:val="1E293B"/>
+                <w:sz w:val="21"/>
+                <w:szCs w:val="21"/>
+              </w:rPr>
+              <w:t xml:space="preserve">Skeleton Loading</w:t>
+            </w:r>
+          </w:p>
+        </w:tc>
+        <w:tc>
+          <w:tcPr>
+            <w:tcW w:type="dxa" w:w="6160"/>
+            <w:tcBorders>
+              <w:top w:val="single" w:color="E2E8F0" w:sz="1"/>
+              <w:left w:val="single" w:color="E2E8F0" w:sz="1"/>
+              <w:bottom w:val="single" w:color="E2E8F0" w:sz="1"/>
+              <w:right w:val="single" w:color="E2E8F0" w:sz="1"/>
+            </w:tcBorders>
+            <w:tcMar>
+              <w:top w:type="dxa" w:w="60"/>
+              <w:left w:type="dxa" w:w="100"/>
+              <w:bottom w:type="dxa" w:w="60"/>
+              <w:right w:type="dxa" w:w="100"/>
+            </w:tcMar>
+          </w:tcPr>
+          <w:p>
+            <w:r>
+              <w:rPr>
+                <w:rFonts w:ascii="Arial" w:cs="Arial" w:eastAsia="Arial" w:hAnsi="Arial"/>
+                <w:color w:val="64748B"/>
+                <w:sz w:val="21"/>
+                <w:szCs w:val="21"/>
+              </w:rPr>
+              <w:t xml:space="preserve">Shimmer placeholders during page loads</w:t>
+            </w:r>
+          </w:p>
+        </w:tc>
+      </w:tr>
+      <w:tr>
+        <w:tc>
+          <w:tcPr>
+            <w:tcW w:type="dxa" w:w="3200"/>
+            <w:tcBorders>
+              <w:top w:val="single" w:color="E2E8F0" w:sz="1"/>
+              <w:left w:val="single" w:color="E2E8F0" w:sz="1"/>
+              <w:bottom w:val="single" w:color="E2E8F0" w:sz="1"/>
+              <w:right w:val="single" w:color="E2E8F0" w:sz="1"/>
+            </w:tcBorders>
+            <w:tcMar>
+              <w:top w:type="dxa" w:w="60"/>
+              <w:left w:type="dxa" w:w="100"/>
+              <w:bottom w:type="dxa" w:w="60"/>
+              <w:right w:type="dxa" w:w="100"/>
+            </w:tcMar>
+          </w:tcPr>
+          <w:p>
+            <w:r>
+              <w:rPr>
+                <w:rFonts w:ascii="Arial" w:cs="Arial" w:eastAsia="Arial" w:hAnsi="Arial"/>
+                <w:b/>
+                <w:bCs/>
+                <w:color w:val="1E293B"/>
+                <w:sz w:val="21"/>
+                <w:szCs w:val="21"/>
+              </w:rPr>
+              <w:t xml:space="preserve">Confirm Dialogs</w:t>
+            </w:r>
+          </w:p>
+        </w:tc>
+        <w:tc>
+          <w:tcPr>
+            <w:tcW w:type="dxa" w:w="6160"/>
+            <w:tcBorders>
+              <w:top w:val="single" w:color="E2E8F0" w:sz="1"/>
+              <w:left w:val="single" w:color="E2E8F0" w:sz="1"/>
+              <w:bottom w:val="single" w:color="E2E8F0" w:sz="1"/>
+              <w:right w:val="single" w:color="E2E8F0" w:sz="1"/>
+            </w:tcBorders>
+            <w:tcMar>
+              <w:top w:type="dxa" w:w="60"/>
+              <w:left w:type="dxa" w:w="100"/>
+              <w:bottom w:type="dxa" w:w="60"/>
+              <w:right w:type="dxa" w:w="100"/>
+            </w:tcMar>
+          </w:tcPr>
+          <w:p>
+            <w:r>
+              <w:rPr>
+                <w:rFonts w:ascii="Arial" w:cs="Arial" w:eastAsia="Arial" w:hAnsi="Arial"/>
+                <w:color w:val="64748B"/>
+                <w:sz w:val="21"/>
+                <w:szCs w:val="21"/>
+              </w:rPr>
+              <w:t xml:space="preserve">"Are you sure?" before destructive actions</w:t>
+            </w:r>
+          </w:p>
+        </w:tc>
+      </w:tr>
+      <w:tr>
+        <w:tc>
+          <w:tcPr>
+            <w:tcW w:type="dxa" w:w="3200"/>
+            <w:tcBorders>
+              <w:top w:val="single" w:color="E2E8F0" w:sz="1"/>
+              <w:left w:val="single" w:color="E2E8F0" w:sz="1"/>
+              <w:bottom w:val="single" w:color="E2E8F0" w:sz="1"/>
+              <w:right w:val="single" w:color="E2E8F0" w:sz="1"/>
+            </w:tcBorders>
+            <w:tcMar>
+              <w:top w:type="dxa" w:w="60"/>
+              <w:left w:type="dxa" w:w="100"/>
+              <w:bottom w:type="dxa" w:w="60"/>
+              <w:right w:type="dxa" w:w="100"/>
+            </w:tcMar>
+          </w:tcPr>
+          <w:p>
+            <w:r>
+              <w:rPr>
+                <w:rFonts w:ascii="Arial" w:cs="Arial" w:eastAsia="Arial" w:hAnsi="Arial"/>
+                <w:b/>
+                <w:bCs/>
+                <w:color w:val="1E293B"/>
+                <w:sz w:val="21"/>
+                <w:szCs w:val="21"/>
+              </w:rPr>
+              <w:t xml:space="preserve">AI Chatbot</w:t>
+            </w:r>
+          </w:p>
+        </w:tc>
+        <w:tc>
+          <w:tcPr>
+            <w:tcW w:type="dxa" w:w="6160"/>
+            <w:tcBorders>
+              <w:top w:val="single" w:color="E2E8F0" w:sz="1"/>
+              <w:left w:val="single" w:color="E2E8F0" w:sz="1"/>
+              <w:bottom w:val="single" w:color="E2E8F0" w:sz="1"/>
+              <w:right w:val="single" w:color="E2E8F0" w:sz="1"/>
+            </w:tcBorders>
+            <w:tcMar>
+              <w:top w:type="dxa" w:w="60"/>
+              <w:left w:type="dxa" w:w="100"/>
+              <w:bottom w:type="dxa" w:w="60"/>
+              <w:right w:type="dxa" w:w="100"/>
+            </w:tcMar>
+          </w:tcPr>
+          <w:p>
+            <w:r>
+              <w:rPr>
+                <w:rFonts w:ascii="Arial" w:cs="Arial" w:eastAsia="Arial" w:hAnsi="Arial"/>
+                <w:color w:val="64748B"/>
+                <w:sz w:val="21"/>
+                <w:szCs w:val="21"/>
+              </w:rPr>
+              <w:t xml:space="preserve">Floating chat bubble with career coach AI</w:t>
+            </w:r>
+          </w:p>
+        </w:tc>
+      </w:tr>
+      <w:tr>
+        <w:tc>
+          <w:tcPr>
+            <w:tcW w:type="dxa" w:w="3200"/>
+            <w:tcBorders>
+              <w:top w:val="single" w:color="E2E8F0" w:sz="1"/>
+              <w:left w:val="single" w:color="E2E8F0" w:sz="1"/>
+              <w:bottom w:val="single" w:color="E2E8F0" w:sz="1"/>
+              <w:right w:val="single" w:color="E2E8F0" w:sz="1"/>
+            </w:tcBorders>
+            <w:tcMar>
+              <w:top w:type="dxa" w:w="60"/>
+              <w:left w:type="dxa" w:w="100"/>
+              <w:bottom w:type="dxa" w:w="60"/>
+              <w:right w:type="dxa" w:w="100"/>
+            </w:tcMar>
+          </w:tcPr>
+          <w:p>
+            <w:r>
+              <w:rPr>
+                <w:rFonts w:ascii="Arial" w:cs="Arial" w:eastAsia="Arial" w:hAnsi="Arial"/>
+                <w:b/>
+                <w:bCs/>
+                <w:color w:val="1E293B"/>
+                <w:sz w:val="21"/>
+                <w:szCs w:val="21"/>
+              </w:rPr>
+              <w:t xml:space="preserve">PWA</w:t>
+            </w:r>
+          </w:p>
+        </w:tc>
+        <w:tc>
+          <w:tcPr>
+            <w:tcW w:type="dxa" w:w="6160"/>
+            <w:tcBorders>
+              <w:top w:val="single" w:color="E2E8F0" w:sz="1"/>
+              <w:left w:val="single" w:color="E2E8F0" w:sz="1"/>
+              <w:bottom w:val="single" w:color="E2E8F0" w:sz="1"/>
+              <w:right w:val="single" w:color="E2E8F0" w:sz="1"/>
+            </w:tcBorders>
+            <w:tcMar>
+              <w:top w:type="dxa" w:w="60"/>
+              <w:left w:type="dxa" w:w="100"/>
+              <w:bottom w:type="dxa" w:w="60"/>
+              <w:right w:type="dxa" w:w="100"/>
+            </w:tcMar>
+          </w:tcPr>
+          <w:p>
+            <w:r>
+              <w:rPr>
+                <w:rFonts w:ascii="Arial" w:cs="Arial" w:eastAsia="Arial" w:hAnsi="Arial"/>
+                <w:color w:val="64748B"/>
+                <w:sz w:val="21"/>
+                <w:szCs w:val="21"/>
+              </w:rPr>
+              <w:t xml:space="preserve">Service worker for offline caching</w:t>
             </w:r>
           </w:p>
         </w:tc>
@@ -5564,67 +5851,7 @@
                 <w:sz w:val="21"/>
                 <w:szCs w:val="21"/>
               </w:rPr>
-              <w:t xml:space="preserve">Bell icon with achievement, XP, and streak notifications</w:t>
-            </w:r>
-          </w:p>
-        </w:tc>
-      </w:tr>
-      <w:tr>
-        <w:tc>
-          <w:tcPr>
-            <w:tcW w:type="dxa" w:w="3200"/>
-            <w:tcBorders>
-              <w:top w:val="single" w:color="E2E8F0" w:sz="1"/>
-              <w:left w:val="single" w:color="E2E8F0" w:sz="1"/>
-              <w:bottom w:val="single" w:color="E2E8F0" w:sz="1"/>
-              <w:right w:val="single" w:color="E2E8F0" w:sz="1"/>
-            </w:tcBorders>
-            <w:tcMar>
-              <w:top w:type="dxa" w:w="60"/>
-              <w:left w:type="dxa" w:w="100"/>
-              <w:bottom w:type="dxa" w:w="60"/>
-              <w:right w:type="dxa" w:w="100"/>
-            </w:tcMar>
-          </w:tcPr>
-          <w:p>
-            <w:r>
-              <w:rPr>
-                <w:rFonts w:ascii="Arial" w:cs="Arial" w:eastAsia="Arial" w:hAnsi="Arial"/>
-                <w:b/>
-                <w:bCs/>
-                <w:color w:val="1E293B"/>
-                <w:sz w:val="21"/>
-                <w:szCs w:val="21"/>
-              </w:rPr>
-              <w:t xml:space="preserve">Collapsible Sidebar</w:t>
-            </w:r>
-          </w:p>
-        </w:tc>
-        <w:tc>
-          <w:tcPr>
-            <w:tcW w:type="dxa" w:w="6160"/>
-            <w:tcBorders>
-              <w:top w:val="single" w:color="E2E8F0" w:sz="1"/>
-              <w:left w:val="single" w:color="E2E8F0" w:sz="1"/>
-              <w:bottom w:val="single" w:color="E2E8F0" w:sz="1"/>
-              <w:right w:val="single" w:color="E2E8F0" w:sz="1"/>
-            </w:tcBorders>
-            <w:tcMar>
-              <w:top w:type="dxa" w:w="60"/>
-              <w:left w:type="dxa" w:w="100"/>
-              <w:bottom w:type="dxa" w:w="60"/>
-              <w:right w:type="dxa" w:w="100"/>
-            </w:tcMar>
-          </w:tcPr>
-          <w:p>
-            <w:r>
-              <w:rPr>
-                <w:rFonts w:ascii="Arial" w:cs="Arial" w:eastAsia="Arial" w:hAnsi="Arial"/>
-                <w:color w:val="64748B"/>
-                <w:sz w:val="21"/>
-                <w:szCs w:val="21"/>
-              </w:rPr>
-              <w:t xml:space="preserve">4 sections (Main, Resume, AI Tools, More) with collapse/expand</w:t>
+              <w:t xml:space="preserve">Bell icon with achievements, XP, streak alerts</w:t>
             </w:r>
           </w:p>
         </w:tc>
@@ -5635,6 +5862,614 @@
         <w:br w:type="page"/>
       </w:r>
     </w:p>
+    <w:p>
+      <w:pPr>
+        <w:pStyle w:val="Heading1"/>
+        <w:spacing w:after="120" w:before="360"/>
+      </w:pPr>
+      <w:r>
+        <w:rPr>
+          <w:rFonts w:ascii="Arial" w:cs="Arial" w:eastAsia="Arial" w:hAnsi="Arial"/>
+          <w:b/>
+          <w:bCs/>
+          <w:color w:val="1E293B"/>
+          <w:sz w:val="36"/>
+          <w:szCs w:val="36"/>
+        </w:rPr>
+        <w:t xml:space="preserve">Settings &amp; Account Management</w:t>
+      </w:r>
+    </w:p>
+    <w:tbl>
+      <w:tblPr>
+        <w:tblW w:type="dxa" w:w="9360"/>
+        <w:tblBorders>
+          <w:top w:val="single" w:color="auto" w:sz="4"/>
+          <w:left w:val="single" w:color="auto" w:sz="4"/>
+          <w:bottom w:val="single" w:color="auto" w:sz="4"/>
+          <w:right w:val="single" w:color="auto" w:sz="4"/>
+          <w:insideH w:val="single" w:color="auto" w:sz="4"/>
+          <w:insideV w:val="single" w:color="auto" w:sz="4"/>
+        </w:tblBorders>
+      </w:tblPr>
+      <w:tblGrid>
+        <w:gridCol w:w="3200"/>
+        <w:gridCol w:w="6160"/>
+      </w:tblGrid>
+      <w:tr>
+        <w:tc>
+          <w:tcPr>
+            <w:tcW w:type="dxa" w:w="9360"/>
+            <w:gridSpan w:val="2"/>
+            <w:tcBorders>
+              <w:top w:val="single" w:color="E2E8F0" w:sz="1"/>
+              <w:left w:val="single" w:color="E2E8F0" w:sz="1"/>
+              <w:bottom w:val="single" w:color="E2E8F0" w:sz="1"/>
+              <w:right w:val="single" w:color="E2E8F0" w:sz="1"/>
+            </w:tcBorders>
+            <w:shd w:fill="2563EB" w:val="clear"/>
+            <w:tcMar>
+              <w:top w:type="dxa" w:w="80"/>
+              <w:left w:type="dxa" w:w="100"/>
+              <w:bottom w:type="dxa" w:w="80"/>
+              <w:right w:type="dxa" w:w="100"/>
+            </w:tcMar>
+          </w:tcPr>
+          <w:p>
+            <w:r>
+              <w:rPr>
+                <w:rFonts w:ascii="Arial" w:cs="Arial" w:eastAsia="Arial" w:hAnsi="Arial"/>
+                <w:b/>
+                <w:bCs/>
+                <w:color w:val="FFFFFF"/>
+                <w:sz w:val="22"/>
+                <w:szCs w:val="22"/>
+              </w:rPr>
+              <w:t xml:space="preserve">Account Features</w:t>
+            </w:r>
+          </w:p>
+        </w:tc>
+      </w:tr>
+      <w:tr>
+        <w:tc>
+          <w:tcPr>
+            <w:tcW w:type="dxa" w:w="3200"/>
+            <w:tcBorders>
+              <w:top w:val="single" w:color="E2E8F0" w:sz="1"/>
+              <w:left w:val="single" w:color="E2E8F0" w:sz="1"/>
+              <w:bottom w:val="single" w:color="E2E8F0" w:sz="1"/>
+              <w:right w:val="single" w:color="E2E8F0" w:sz="1"/>
+            </w:tcBorders>
+            <w:tcMar>
+              <w:top w:type="dxa" w:w="60"/>
+              <w:left w:type="dxa" w:w="100"/>
+              <w:bottom w:type="dxa" w:w="60"/>
+              <w:right w:type="dxa" w:w="100"/>
+            </w:tcMar>
+          </w:tcPr>
+          <w:p>
+            <w:r>
+              <w:rPr>
+                <w:rFonts w:ascii="Arial" w:cs="Arial" w:eastAsia="Arial" w:hAnsi="Arial"/>
+                <w:b/>
+                <w:bCs/>
+                <w:color w:val="1E293B"/>
+                <w:sz w:val="21"/>
+                <w:szCs w:val="21"/>
+              </w:rPr>
+              <w:t xml:space="preserve">Profile Editor</w:t>
+            </w:r>
+          </w:p>
+        </w:tc>
+        <w:tc>
+          <w:tcPr>
+            <w:tcW w:type="dxa" w:w="6160"/>
+            <w:tcBorders>
+              <w:top w:val="single" w:color="E2E8F0" w:sz="1"/>
+              <w:left w:val="single" w:color="E2E8F0" w:sz="1"/>
+              <w:bottom w:val="single" w:color="E2E8F0" w:sz="1"/>
+              <w:right w:val="single" w:color="E2E8F0" w:sz="1"/>
+            </w:tcBorders>
+            <w:tcMar>
+              <w:top w:type="dxa" w:w="60"/>
+              <w:left w:type="dxa" w:w="100"/>
+              <w:bottom w:type="dxa" w:w="60"/>
+              <w:right w:type="dxa" w:w="100"/>
+            </w:tcMar>
+          </w:tcPr>
+          <w:p>
+            <w:r>
+              <w:rPr>
+                <w:rFonts w:ascii="Arial" w:cs="Arial" w:eastAsia="Arial" w:hAnsi="Arial"/>
+                <w:color w:val="64748B"/>
+                <w:sz w:val="21"/>
+                <w:szCs w:val="21"/>
+              </w:rPr>
+              <w:t xml:space="preserve">Name, location, role, experience, skills</w:t>
+            </w:r>
+          </w:p>
+        </w:tc>
+      </w:tr>
+      <w:tr>
+        <w:tc>
+          <w:tcPr>
+            <w:tcW w:type="dxa" w:w="3200"/>
+            <w:tcBorders>
+              <w:top w:val="single" w:color="E2E8F0" w:sz="1"/>
+              <w:left w:val="single" w:color="E2E8F0" w:sz="1"/>
+              <w:bottom w:val="single" w:color="E2E8F0" w:sz="1"/>
+              <w:right w:val="single" w:color="E2E8F0" w:sz="1"/>
+            </w:tcBorders>
+            <w:tcMar>
+              <w:top w:type="dxa" w:w="60"/>
+              <w:left w:type="dxa" w:w="100"/>
+              <w:bottom w:type="dxa" w:w="60"/>
+              <w:right w:type="dxa" w:w="100"/>
+            </w:tcMar>
+          </w:tcPr>
+          <w:p>
+            <w:r>
+              <w:rPr>
+                <w:rFonts w:ascii="Arial" w:cs="Arial" w:eastAsia="Arial" w:hAnsi="Arial"/>
+                <w:b/>
+                <w:bCs/>
+                <w:color w:val="1E293B"/>
+                <w:sz w:val="21"/>
+                <w:szCs w:val="21"/>
+              </w:rPr>
+              <w:t xml:space="preserve">Telegram Notifications</w:t>
+            </w:r>
+          </w:p>
+        </w:tc>
+        <w:tc>
+          <w:tcPr>
+            <w:tcW w:type="dxa" w:w="6160"/>
+            <w:tcBorders>
+              <w:top w:val="single" w:color="E2E8F0" w:sz="1"/>
+              <w:left w:val="single" w:color="E2E8F0" w:sz="1"/>
+              <w:bottom w:val="single" w:color="E2E8F0" w:sz="1"/>
+              <w:right w:val="single" w:color="E2E8F0" w:sz="1"/>
+            </w:tcBorders>
+            <w:tcMar>
+              <w:top w:type="dxa" w:w="60"/>
+              <w:left w:type="dxa" w:w="100"/>
+              <w:bottom w:type="dxa" w:w="60"/>
+              <w:right w:type="dxa" w:w="100"/>
+            </w:tcMar>
+          </w:tcPr>
+          <w:p>
+            <w:r>
+              <w:rPr>
+                <w:rFonts w:ascii="Arial" w:cs="Arial" w:eastAsia="Arial" w:hAnsi="Arial"/>
+                <w:color w:val="64748B"/>
+                <w:sz w:val="21"/>
+                <w:szCs w:val="21"/>
+              </w:rPr>
+              <w:t xml:space="preserve">Connect bot, test, disconnect</w:t>
+            </w:r>
+          </w:p>
+        </w:tc>
+      </w:tr>
+      <w:tr>
+        <w:tc>
+          <w:tcPr>
+            <w:tcW w:type="dxa" w:w="3200"/>
+            <w:tcBorders>
+              <w:top w:val="single" w:color="E2E8F0" w:sz="1"/>
+              <w:left w:val="single" w:color="E2E8F0" w:sz="1"/>
+              <w:bottom w:val="single" w:color="E2E8F0" w:sz="1"/>
+              <w:right w:val="single" w:color="E2E8F0" w:sz="1"/>
+            </w:tcBorders>
+            <w:tcMar>
+              <w:top w:type="dxa" w:w="60"/>
+              <w:left w:type="dxa" w:w="100"/>
+              <w:bottom w:type="dxa" w:w="60"/>
+              <w:right w:type="dxa" w:w="100"/>
+            </w:tcMar>
+          </w:tcPr>
+          <w:p>
+            <w:r>
+              <w:rPr>
+                <w:rFonts w:ascii="Arial" w:cs="Arial" w:eastAsia="Arial" w:hAnsi="Arial"/>
+                <w:b/>
+                <w:bCs/>
+                <w:color w:val="1E293B"/>
+                <w:sz w:val="21"/>
+                <w:szCs w:val="21"/>
+              </w:rPr>
+              <w:t xml:space="preserve">Referral Program</w:t>
+            </w:r>
+          </w:p>
+        </w:tc>
+        <w:tc>
+          <w:tcPr>
+            <w:tcW w:type="dxa" w:w="6160"/>
+            <w:tcBorders>
+              <w:top w:val="single" w:color="E2E8F0" w:sz="1"/>
+              <w:left w:val="single" w:color="E2E8F0" w:sz="1"/>
+              <w:bottom w:val="single" w:color="E2E8F0" w:sz="1"/>
+              <w:right w:val="single" w:color="E2E8F0" w:sz="1"/>
+            </w:tcBorders>
+            <w:tcMar>
+              <w:top w:type="dxa" w:w="60"/>
+              <w:left w:type="dxa" w:w="100"/>
+              <w:bottom w:type="dxa" w:w="60"/>
+              <w:right w:type="dxa" w:w="100"/>
+            </w:tcMar>
+          </w:tcPr>
+          <w:p>
+            <w:r>
+              <w:rPr>
+                <w:rFonts w:ascii="Arial" w:cs="Arial" w:eastAsia="Arial" w:hAnsi="Arial"/>
+                <w:color w:val="64748B"/>
+                <w:sz w:val="21"/>
+                <w:szCs w:val="21"/>
+              </w:rPr>
+              <w:t xml:space="preserve">Copy referral link, track signups</w:t>
+            </w:r>
+          </w:p>
+        </w:tc>
+      </w:tr>
+      <w:tr>
+        <w:tc>
+          <w:tcPr>
+            <w:tcW w:type="dxa" w:w="3200"/>
+            <w:tcBorders>
+              <w:top w:val="single" w:color="E2E8F0" w:sz="1"/>
+              <w:left w:val="single" w:color="E2E8F0" w:sz="1"/>
+              <w:bottom w:val="single" w:color="E2E8F0" w:sz="1"/>
+              <w:right w:val="single" w:color="E2E8F0" w:sz="1"/>
+            </w:tcBorders>
+            <w:tcMar>
+              <w:top w:type="dxa" w:w="60"/>
+              <w:left w:type="dxa" w:w="100"/>
+              <w:bottom w:type="dxa" w:w="60"/>
+              <w:right w:type="dxa" w:w="100"/>
+            </w:tcMar>
+          </w:tcPr>
+          <w:p>
+            <w:r>
+              <w:rPr>
+                <w:rFonts w:ascii="Arial" w:cs="Arial" w:eastAsia="Arial" w:hAnsi="Arial"/>
+                <w:b/>
+                <w:bCs/>
+                <w:color w:val="1E293B"/>
+                <w:sz w:val="21"/>
+                <w:szCs w:val="21"/>
+              </w:rPr>
+              <w:t xml:space="preserve">CSV Import</w:t>
+            </w:r>
+          </w:p>
+        </w:tc>
+        <w:tc>
+          <w:tcPr>
+            <w:tcW w:type="dxa" w:w="6160"/>
+            <w:tcBorders>
+              <w:top w:val="single" w:color="E2E8F0" w:sz="1"/>
+              <w:left w:val="single" w:color="E2E8F0" w:sz="1"/>
+              <w:bottom w:val="single" w:color="E2E8F0" w:sz="1"/>
+              <w:right w:val="single" w:color="E2E8F0" w:sz="1"/>
+            </w:tcBorders>
+            <w:tcMar>
+              <w:top w:type="dxa" w:w="60"/>
+              <w:left w:type="dxa" w:w="100"/>
+              <w:bottom w:type="dxa" w:w="60"/>
+              <w:right w:type="dxa" w:w="100"/>
+            </w:tcMar>
+          </w:tcPr>
+          <w:p>
+            <w:r>
+              <w:rPr>
+                <w:rFonts w:ascii="Arial" w:cs="Arial" w:eastAsia="Arial" w:hAnsi="Arial"/>
+                <w:color w:val="64748B"/>
+                <w:sz w:val="21"/>
+                <w:szCs w:val="21"/>
+              </w:rPr>
+              <w:t xml:space="preserve">Upload spreadsheet to bulk import applications</w:t>
+            </w:r>
+          </w:p>
+        </w:tc>
+      </w:tr>
+      <w:tr>
+        <w:tc>
+          <w:tcPr>
+            <w:tcW w:type="dxa" w:w="3200"/>
+            <w:tcBorders>
+              <w:top w:val="single" w:color="E2E8F0" w:sz="1"/>
+              <w:left w:val="single" w:color="E2E8F0" w:sz="1"/>
+              <w:bottom w:val="single" w:color="E2E8F0" w:sz="1"/>
+              <w:right w:val="single" w:color="E2E8F0" w:sz="1"/>
+            </w:tcBorders>
+            <w:tcMar>
+              <w:top w:type="dxa" w:w="60"/>
+              <w:left w:type="dxa" w:w="100"/>
+              <w:bottom w:type="dxa" w:w="60"/>
+              <w:right w:type="dxa" w:w="100"/>
+            </w:tcMar>
+          </w:tcPr>
+          <w:p>
+            <w:r>
+              <w:rPr>
+                <w:rFonts w:ascii="Arial" w:cs="Arial" w:eastAsia="Arial" w:hAnsi="Arial"/>
+                <w:b/>
+                <w:bCs/>
+                <w:color w:val="1E293B"/>
+                <w:sz w:val="21"/>
+                <w:szCs w:val="21"/>
+              </w:rPr>
+              <w:t xml:space="preserve">CSV Export</w:t>
+            </w:r>
+          </w:p>
+        </w:tc>
+        <w:tc>
+          <w:tcPr>
+            <w:tcW w:type="dxa" w:w="6160"/>
+            <w:tcBorders>
+              <w:top w:val="single" w:color="E2E8F0" w:sz="1"/>
+              <w:left w:val="single" w:color="E2E8F0" w:sz="1"/>
+              <w:bottom w:val="single" w:color="E2E8F0" w:sz="1"/>
+              <w:right w:val="single" w:color="E2E8F0" w:sz="1"/>
+            </w:tcBorders>
+            <w:tcMar>
+              <w:top w:type="dxa" w:w="60"/>
+              <w:left w:type="dxa" w:w="100"/>
+              <w:bottom w:type="dxa" w:w="60"/>
+              <w:right w:type="dxa" w:w="100"/>
+            </w:tcMar>
+          </w:tcPr>
+          <w:p>
+            <w:r>
+              <w:rPr>
+                <w:rFonts w:ascii="Arial" w:cs="Arial" w:eastAsia="Arial" w:hAnsi="Arial"/>
+                <w:color w:val="64748B"/>
+                <w:sz w:val="21"/>
+                <w:szCs w:val="21"/>
+              </w:rPr>
+              <w:t xml:space="preserve">Download applications as CSV</w:t>
+            </w:r>
+          </w:p>
+        </w:tc>
+      </w:tr>
+      <w:tr>
+        <w:tc>
+          <w:tcPr>
+            <w:tcW w:type="dxa" w:w="3200"/>
+            <w:tcBorders>
+              <w:top w:val="single" w:color="E2E8F0" w:sz="1"/>
+              <w:left w:val="single" w:color="E2E8F0" w:sz="1"/>
+              <w:bottom w:val="single" w:color="E2E8F0" w:sz="1"/>
+              <w:right w:val="single" w:color="E2E8F0" w:sz="1"/>
+            </w:tcBorders>
+            <w:tcMar>
+              <w:top w:type="dxa" w:w="60"/>
+              <w:left w:type="dxa" w:w="100"/>
+              <w:bottom w:type="dxa" w:w="60"/>
+              <w:right w:type="dxa" w:w="100"/>
+            </w:tcMar>
+          </w:tcPr>
+          <w:p>
+            <w:r>
+              <w:rPr>
+                <w:rFonts w:ascii="Arial" w:cs="Arial" w:eastAsia="Arial" w:hAnsi="Arial"/>
+                <w:b/>
+                <w:bCs/>
+                <w:color w:val="1E293B"/>
+                <w:sz w:val="21"/>
+                <w:szCs w:val="21"/>
+              </w:rPr>
+              <w:t xml:space="preserve">Full Data Export</w:t>
+            </w:r>
+          </w:p>
+        </w:tc>
+        <w:tc>
+          <w:tcPr>
+            <w:tcW w:type="dxa" w:w="6160"/>
+            <w:tcBorders>
+              <w:top w:val="single" w:color="E2E8F0" w:sz="1"/>
+              <w:left w:val="single" w:color="E2E8F0" w:sz="1"/>
+              <w:bottom w:val="single" w:color="E2E8F0" w:sz="1"/>
+              <w:right w:val="single" w:color="E2E8F0" w:sz="1"/>
+            </w:tcBorders>
+            <w:tcMar>
+              <w:top w:type="dxa" w:w="60"/>
+              <w:left w:type="dxa" w:w="100"/>
+              <w:bottom w:type="dxa" w:w="60"/>
+              <w:right w:type="dxa" w:w="100"/>
+            </w:tcMar>
+          </w:tcPr>
+          <w:p>
+            <w:r>
+              <w:rPr>
+                <w:rFonts w:ascii="Arial" w:cs="Arial" w:eastAsia="Arial" w:hAnsi="Arial"/>
+                <w:color w:val="64748B"/>
+                <w:sz w:val="21"/>
+                <w:szCs w:val="21"/>
+              </w:rPr>
+              <w:t xml:space="preserve">JSON export of all personal data (GDPR)</w:t>
+            </w:r>
+          </w:p>
+        </w:tc>
+      </w:tr>
+      <w:tr>
+        <w:tc>
+          <w:tcPr>
+            <w:tcW w:type="dxa" w:w="3200"/>
+            <w:tcBorders>
+              <w:top w:val="single" w:color="E2E8F0" w:sz="1"/>
+              <w:left w:val="single" w:color="E2E8F0" w:sz="1"/>
+              <w:bottom w:val="single" w:color="E2E8F0" w:sz="1"/>
+              <w:right w:val="single" w:color="E2E8F0" w:sz="1"/>
+            </w:tcBorders>
+            <w:tcMar>
+              <w:top w:type="dxa" w:w="60"/>
+              <w:left w:type="dxa" w:w="100"/>
+              <w:bottom w:type="dxa" w:w="60"/>
+              <w:right w:type="dxa" w:w="100"/>
+            </w:tcMar>
+          </w:tcPr>
+          <w:p>
+            <w:r>
+              <w:rPr>
+                <w:rFonts w:ascii="Arial" w:cs="Arial" w:eastAsia="Arial" w:hAnsi="Arial"/>
+                <w:b/>
+                <w:bCs/>
+                <w:color w:val="1E293B"/>
+                <w:sz w:val="21"/>
+                <w:szCs w:val="21"/>
+              </w:rPr>
+              <w:t xml:space="preserve">Account Deletion</w:t>
+            </w:r>
+          </w:p>
+        </w:tc>
+        <w:tc>
+          <w:tcPr>
+            <w:tcW w:type="dxa" w:w="6160"/>
+            <w:tcBorders>
+              <w:top w:val="single" w:color="E2E8F0" w:sz="1"/>
+              <w:left w:val="single" w:color="E2E8F0" w:sz="1"/>
+              <w:bottom w:val="single" w:color="E2E8F0" w:sz="1"/>
+              <w:right w:val="single" w:color="E2E8F0" w:sz="1"/>
+            </w:tcBorders>
+            <w:tcMar>
+              <w:top w:type="dxa" w:w="60"/>
+              <w:left w:type="dxa" w:w="100"/>
+              <w:bottom w:type="dxa" w:w="60"/>
+              <w:right w:type="dxa" w:w="100"/>
+            </w:tcMar>
+          </w:tcPr>
+          <w:p>
+            <w:r>
+              <w:rPr>
+                <w:rFonts w:ascii="Arial" w:cs="Arial" w:eastAsia="Arial" w:hAnsi="Arial"/>
+                <w:color w:val="64748B"/>
+                <w:sz w:val="21"/>
+                <w:szCs w:val="21"/>
+              </w:rPr>
+              <w:t xml:space="preserve">Self-serve permanent account deletion with confirmation</w:t>
+            </w:r>
+          </w:p>
+        </w:tc>
+      </w:tr>
+      <w:tr>
+        <w:tc>
+          <w:tcPr>
+            <w:tcW w:type="dxa" w:w="3200"/>
+            <w:tcBorders>
+              <w:top w:val="single" w:color="E2E8F0" w:sz="1"/>
+              <w:left w:val="single" w:color="E2E8F0" w:sz="1"/>
+              <w:bottom w:val="single" w:color="E2E8F0" w:sz="1"/>
+              <w:right w:val="single" w:color="E2E8F0" w:sz="1"/>
+            </w:tcBorders>
+            <w:tcMar>
+              <w:top w:type="dxa" w:w="60"/>
+              <w:left w:type="dxa" w:w="100"/>
+              <w:bottom w:type="dxa" w:w="60"/>
+              <w:right w:type="dxa" w:w="100"/>
+            </w:tcMar>
+          </w:tcPr>
+          <w:p>
+            <w:r>
+              <w:rPr>
+                <w:rFonts w:ascii="Arial" w:cs="Arial" w:eastAsia="Arial" w:hAnsi="Arial"/>
+                <w:b/>
+                <w:bCs/>
+                <w:color w:val="1E293B"/>
+                <w:sz w:val="21"/>
+                <w:szCs w:val="21"/>
+              </w:rPr>
+              <w:t xml:space="preserve">Calendar Events</w:t>
+            </w:r>
+          </w:p>
+        </w:tc>
+        <w:tc>
+          <w:tcPr>
+            <w:tcW w:type="dxa" w:w="6160"/>
+            <w:tcBorders>
+              <w:top w:val="single" w:color="E2E8F0" w:sz="1"/>
+              <w:left w:val="single" w:color="E2E8F0" w:sz="1"/>
+              <w:bottom w:val="single" w:color="E2E8F0" w:sz="1"/>
+              <w:right w:val="single" w:color="E2E8F0" w:sz="1"/>
+            </w:tcBorders>
+            <w:tcMar>
+              <w:top w:type="dxa" w:w="60"/>
+              <w:left w:type="dxa" w:w="100"/>
+              <w:bottom w:type="dxa" w:w="60"/>
+              <w:right w:type="dxa" w:w="100"/>
+            </w:tcMar>
+          </w:tcPr>
+          <w:p>
+            <w:r>
+              <w:rPr>
+                <w:rFonts w:ascii="Arial" w:cs="Arial" w:eastAsia="Arial" w:hAnsi="Arial"/>
+                <w:color w:val="64748B"/>
+                <w:sz w:val="21"/>
+                <w:szCs w:val="21"/>
+              </w:rPr>
+              <w:t xml:space="preserve">Add custom events, export as .ics for Google Calendar/Outlook</w:t>
+            </w:r>
+          </w:p>
+        </w:tc>
+      </w:tr>
+      <w:tr>
+        <w:tc>
+          <w:tcPr>
+            <w:tcW w:type="dxa" w:w="3200"/>
+            <w:tcBorders>
+              <w:top w:val="single" w:color="E2E8F0" w:sz="1"/>
+              <w:left w:val="single" w:color="E2E8F0" w:sz="1"/>
+              <w:bottom w:val="single" w:color="E2E8F0" w:sz="1"/>
+              <w:right w:val="single" w:color="E2E8F0" w:sz="1"/>
+            </w:tcBorders>
+            <w:tcMar>
+              <w:top w:type="dxa" w:w="60"/>
+              <w:left w:type="dxa" w:w="100"/>
+              <w:bottom w:type="dxa" w:w="60"/>
+              <w:right w:type="dxa" w:w="100"/>
+            </w:tcMar>
+          </w:tcPr>
+          <w:p>
+            <w:r>
+              <w:rPr>
+                <w:rFonts w:ascii="Arial" w:cs="Arial" w:eastAsia="Arial" w:hAnsi="Arial"/>
+                <w:b/>
+                <w:bCs/>
+                <w:color w:val="1E293B"/>
+                <w:sz w:val="21"/>
+                <w:szCs w:val="21"/>
+              </w:rPr>
+              <w:t xml:space="preserve">Duplicate Detection</w:t>
+            </w:r>
+          </w:p>
+        </w:tc>
+        <w:tc>
+          <w:tcPr>
+            <w:tcW w:type="dxa" w:w="6160"/>
+            <w:tcBorders>
+              <w:top w:val="single" w:color="E2E8F0" w:sz="1"/>
+              <w:left w:val="single" w:color="E2E8F0" w:sz="1"/>
+              <w:bottom w:val="single" w:color="E2E8F0" w:sz="1"/>
+              <w:right w:val="single" w:color="E2E8F0" w:sz="1"/>
+            </w:tcBorders>
+            <w:tcMar>
+              <w:top w:type="dxa" w:w="60"/>
+              <w:left w:type="dxa" w:w="100"/>
+              <w:bottom w:type="dxa" w:w="60"/>
+              <w:right w:type="dxa" w:w="100"/>
+            </w:tcMar>
+          </w:tcPr>
+          <w:p>
+            <w:r>
+              <w:rPr>
+                <w:rFonts w:ascii="Arial" w:cs="Arial" w:eastAsia="Arial" w:hAnsi="Arial"/>
+                <w:color w:val="64748B"/>
+                <w:sz w:val="21"/>
+                <w:szCs w:val="21"/>
+              </w:rPr>
+              <w:t xml:space="preserve">Warns when importing a job URL that already exists</w:t>
+            </w:r>
+          </w:p>
+        </w:tc>
+      </w:tr>
+    </w:tbl>
     <w:p>
       <w:pPr>
         <w:pStyle w:val="Heading1"/>
@@ -5756,7 +6591,7 @@
           <w:sz w:val="22"/>
           <w:szCs w:val="22"/>
         </w:rPr>
-        <w:t xml:space="preserve">Groq (Llama 3.3 70B) for all AI generation</w:t>
+        <w:t xml:space="preserve">Groq (Llama 3.3 70B) — 16 AI functions</w:t>
       </w:r>
     </w:p>
     <w:p>
@@ -5786,7 +6621,7 @@
           <w:sz w:val="22"/>
           <w:szCs w:val="22"/>
         </w:rPr>
-        <w:t xml:space="preserve">Stripe with Free/Pro/Team tiers</w:t>
+        <w:t xml:space="preserve">Stripe with Free ($0) / Pro ($9.99) / Team ($29.99) tiers</w:t>
       </w:r>
     </w:p>
     <w:p>
@@ -5876,7 +6711,7 @@
           <w:sz w:val="22"/>
           <w:szCs w:val="22"/>
         </w:rPr>
-        <w:t xml:space="preserve">Recharts (bar, line, pie, funnel), custom SVG progress rings</w:t>
+        <w:t xml:space="preserve">Recharts (bar, line, pie, funnel), custom SVG rings, heatmaps</w:t>
       </w:r>
     </w:p>
     <w:p>
@@ -5907,6 +6742,36 @@
           <w:szCs w:val="22"/>
         </w:rPr>
         <w:t xml:space="preserve">@dnd-kit for Kanban drag-and-drop</w:t>
+      </w:r>
+    </w:p>
+    <w:p>
+      <w:pPr>
+        <w:pStyle w:val="ListParagraph"/>
+        <w:numPr>
+          <w:ilvl w:val="0"/>
+          <w:numId w:val="2"/>
+        </w:numPr>
+        <w:spacing w:after="60"/>
+      </w:pPr>
+      <w:r>
+        <w:rPr>
+          <w:rFonts w:ascii="Arial" w:cs="Arial" w:eastAsia="Arial" w:hAnsi="Arial"/>
+          <w:b/>
+          <w:bCs/>
+          <w:color w:val="1E293B"/>
+          <w:sz w:val="22"/>
+          <w:szCs w:val="22"/>
+        </w:rPr>
+        <w:t xml:space="preserve">Animations: </w:t>
+      </w:r>
+      <w:r>
+        <w:rPr>
+          <w:rFonts w:ascii="Arial" w:cs="Arial" w:eastAsia="Arial" w:hAnsi="Arial"/>
+          <w:color w:val="64748B"/>
+          <w:sz w:val="22"/>
+          <w:szCs w:val="22"/>
+        </w:rPr>
+        <w:t xml:space="preserve">canvas-confetti for celebration effects</w:t>
       </w:r>
     </w:p>
     <w:p>
@@ -5966,100 +6831,7 @@
           <w:sz w:val="22"/>
           <w:szCs w:val="22"/>
         </w:rPr>
-        <w:t xml:space="preserve">Manifest v3 with content scripts for hh.ru/staff.am</w:t>
-      </w:r>
-    </w:p>
-    <w:p>
-      <w:pPr>
-        <w:pStyle w:val="Heading2"/>
-        <w:spacing w:after="120" w:before="240"/>
-      </w:pPr>
-      <w:r>
-        <w:rPr>
-          <w:rFonts w:ascii="Arial" w:cs="Arial" w:eastAsia="Arial" w:hAnsi="Arial"/>
-          <w:b/>
-          <w:bCs/>
-          <w:color w:val="1E293B"/>
-          <w:sz w:val="28"/>
-          <w:szCs w:val="28"/>
-        </w:rPr>
-        <w:t xml:space="preserve">Security</w:t>
-      </w:r>
-    </w:p>
-    <w:p>
-      <w:pPr>
-        <w:pStyle w:val="ListParagraph"/>
-        <w:numPr>
-          <w:ilvl w:val="0"/>
-          <w:numId w:val="2"/>
-        </w:numPr>
-        <w:spacing w:after="60"/>
-      </w:pPr>
-      <w:r>
-        <w:rPr>
-          <w:rFonts w:ascii="Arial" w:cs="Arial" w:eastAsia="Arial" w:hAnsi="Arial"/>
-          <w:color w:val="64748B"/>
-          <w:sz w:val="22"/>
-          <w:szCs w:val="22"/>
-        </w:rPr>
-        <w:t xml:space="preserve">Row Level Security on all 15 tables — users can only access their own data</w:t>
-      </w:r>
-    </w:p>
-    <w:p>
-      <w:pPr>
-        <w:pStyle w:val="ListParagraph"/>
-        <w:numPr>
-          <w:ilvl w:val="0"/>
-          <w:numId w:val="2"/>
-        </w:numPr>
-        <w:spacing w:after="60"/>
-      </w:pPr>
-      <w:r>
-        <w:rPr>
-          <w:rFonts w:ascii="Arial" w:cs="Arial" w:eastAsia="Arial" w:hAnsi="Arial"/>
-          <w:color w:val="64748B"/>
-          <w:sz w:val="22"/>
-          <w:szCs w:val="22"/>
-        </w:rPr>
-        <w:t xml:space="preserve">Supabase Auth with email/password and Google OAuth</w:t>
-      </w:r>
-    </w:p>
-    <w:p>
-      <w:pPr>
-        <w:pStyle w:val="ListParagraph"/>
-        <w:numPr>
-          <w:ilvl w:val="0"/>
-          <w:numId w:val="2"/>
-        </w:numPr>
-        <w:spacing w:after="60"/>
-      </w:pPr>
-      <w:r>
-        <w:rPr>
-          <w:rFonts w:ascii="Arial" w:cs="Arial" w:eastAsia="Arial" w:hAnsi="Arial"/>
-          <w:color w:val="64748B"/>
-          <w:sz w:val="22"/>
-          <w:szCs w:val="22"/>
-        </w:rPr>
-        <w:t xml:space="preserve">Service role key for server-side operations only</w:t>
-      </w:r>
-    </w:p>
-    <w:p>
-      <w:pPr>
-        <w:pStyle w:val="ListParagraph"/>
-        <w:numPr>
-          <w:ilvl w:val="0"/>
-          <w:numId w:val="2"/>
-        </w:numPr>
-        <w:spacing w:after="60"/>
-      </w:pPr>
-      <w:r>
-        <w:rPr>
-          <w:rFonts w:ascii="Arial" w:cs="Arial" w:eastAsia="Arial" w:hAnsi="Arial"/>
-          <w:color w:val="64748B"/>
-          <w:sz w:val="22"/>
-          <w:szCs w:val="22"/>
-        </w:rPr>
-        <w:t xml:space="preserve">Stripe webhook verification</w:t>
+        <w:t xml:space="preserve">Manifest v3 with content scripts</w:t>
       </w:r>
     </w:p>
     <w:p>
@@ -6184,7 +6956,7 @@
                 <w:sz w:val="21"/>
                 <w:szCs w:val="21"/>
               </w:rPr>
-              <w:t xml:space="preserve">Hero, features, testimonials, pricing, CTA with dark mode support</w:t>
+              <w:t xml:space="preserve">Animated hero with typing effect, gradient bg, dark mode</w:t>
             </w:r>
           </w:p>
         </w:tc>
@@ -6304,7 +7076,7 @@
                 <w:sz w:val="21"/>
                 <w:szCs w:val="21"/>
               </w:rPr>
-              <w:t xml:space="preserve">6 user stories with metrics + global stats (50K+ apps, 8K+ interviews)</w:t>
+              <w:t xml:space="preserve">6 user stories with metrics (50K+ apps, 8K+ interviews)</w:t>
             </w:r>
           </w:p>
         </w:tc>
@@ -6364,7 +7136,7 @@
                 <w:sz w:val="21"/>
                 <w:szCs w:val="21"/>
               </w:rPr>
-              <w:t xml:space="preserve">6 full SEO articles with individual /blog/[slug] pages</w:t>
+              <w:t xml:space="preserve">6 full SEO articles with individual pages</w:t>
             </w:r>
           </w:p>
         </w:tc>
@@ -6424,7 +7196,7 @@
                 <w:sz w:val="21"/>
                 <w:szCs w:val="21"/>
               </w:rPr>
-              <w:t xml:space="preserve">vs Teal, vs Huntr, vs LazyApply, vs Jobscan with feature tables</w:t>
+              <w:t xml:space="preserve">vs Teal, vs Huntr, vs LazyApply, vs Jobscan</w:t>
             </w:r>
           </w:p>
         </w:tc>
@@ -6544,7 +7316,7 @@
                 <w:sz w:val="21"/>
                 <w:szCs w:val="21"/>
               </w:rPr>
-              <w:t xml:space="preserve">Version history from v1.0 to v3.0 with timeline</w:t>
+              <w:t xml:space="preserve">v1.0 to v3.0 with timeline</w:t>
             </w:r>
           </w:p>
         </w:tc>
@@ -6605,6 +7377,66 @@
                 <w:szCs w:val="21"/>
               </w:rPr>
               <w:t xml:space="preserve">Complete legal pages</w:t>
+            </w:r>
+          </w:p>
+        </w:tc>
+      </w:tr>
+      <w:tr>
+        <w:tc>
+          <w:tcPr>
+            <w:tcW w:type="dxa" w:w="3200"/>
+            <w:tcBorders>
+              <w:top w:val="single" w:color="E2E8F0" w:sz="1"/>
+              <w:left w:val="single" w:color="E2E8F0" w:sz="1"/>
+              <w:bottom w:val="single" w:color="E2E8F0" w:sz="1"/>
+              <w:right w:val="single" w:color="E2E8F0" w:sz="1"/>
+            </w:tcBorders>
+            <w:tcMar>
+              <w:top w:type="dxa" w:w="60"/>
+              <w:left w:type="dxa" w:w="100"/>
+              <w:bottom w:type="dxa" w:w="60"/>
+              <w:right w:type="dxa" w:w="100"/>
+            </w:tcMar>
+          </w:tcPr>
+          <w:p>
+            <w:r>
+              <w:rPr>
+                <w:rFonts w:ascii="Arial" w:cs="Arial" w:eastAsia="Arial" w:hAnsi="Arial"/>
+                <w:b/>
+                <w:bCs/>
+                <w:color w:val="1E293B"/>
+                <w:sz w:val="21"/>
+                <w:szCs w:val="21"/>
+              </w:rPr>
+              <w:t xml:space="preserve">Portfolio Pages</w:t>
+            </w:r>
+          </w:p>
+        </w:tc>
+        <w:tc>
+          <w:tcPr>
+            <w:tcW w:type="dxa" w:w="6160"/>
+            <w:tcBorders>
+              <w:top w:val="single" w:color="E2E8F0" w:sz="1"/>
+              <w:left w:val="single" w:color="E2E8F0" w:sz="1"/>
+              <w:bottom w:val="single" w:color="E2E8F0" w:sz="1"/>
+              <w:right w:val="single" w:color="E2E8F0" w:sz="1"/>
+            </w:tcBorders>
+            <w:tcMar>
+              <w:top w:type="dxa" w:w="60"/>
+              <w:left w:type="dxa" w:w="100"/>
+              <w:bottom w:type="dxa" w:w="60"/>
+              <w:right w:type="dxa" w:w="100"/>
+            </w:tcMar>
+          </w:tcPr>
+          <w:p>
+            <w:r>
+              <w:rPr>
+                <w:rFonts w:ascii="Arial" w:cs="Arial" w:eastAsia="Arial" w:hAnsi="Arial"/>
+                <w:color w:val="64748B"/>
+                <w:sz w:val="21"/>
+                <w:szCs w:val="21"/>
+              </w:rPr>
+              <w:t xml:space="preserve">Public /p/[slug] with themed rendering</w:t>
             </w:r>
           </w:p>
         </w:tc>
@@ -6884,6 +7716,24 @@
               <w:t xml:space="preserve">Chrome extension</w:t>
             </w:r>
           </w:p>
+          <w:p>
+            <w:pPr>
+              <w:spacing w:after="120"/>
+              <w:rPr>
+                <w:sz w:val="20"/>
+                <w:szCs w:val="20"/>
+              </w:rPr>
+            </w:pPr>
+            <w:r>
+              <w:rPr>
+                <w:rFonts w:ascii="Arial" w:cs="Arial" w:eastAsia="Arial" w:hAnsi="Arial"/>
+                <w:color w:val="64748B"/>
+                <w:sz w:val="20"/>
+                <w:szCs w:val="20"/>
+              </w:rPr>
+              <w:t xml:space="preserve">Calendar &amp; search</w:t>
+            </w:r>
+          </w:p>
         </w:tc>
         <w:tc>
           <w:tcPr>
@@ -6934,7 +7784,7 @@
                 <w:sz w:val="20"/>
                 <w:szCs w:val="20"/>
               </w:rPr>
-              <w:t xml:space="preserve">All 5 templates</w:t>
+              <w:t xml:space="preserve">All 5 templates + tailoring</w:t>
             </w:r>
           </w:p>
           <w:p>
@@ -6952,7 +7802,7 @@
                 <w:sz w:val="20"/>
                 <w:szCs w:val="20"/>
               </w:rPr>
-              <w:t xml:space="preserve">All AI tools</w:t>
+              <w:t xml:space="preserve">All 16 AI tools</w:t>
             </w:r>
           </w:p>
           <w:p>
@@ -6989,6 +7839,42 @@
                 <w:szCs w:val="20"/>
               </w:rPr>
               <w:t xml:space="preserve">Advanced analytics</w:t>
+            </w:r>
+          </w:p>
+          <w:p>
+            <w:pPr>
+              <w:spacing w:after="120"/>
+              <w:rPr>
+                <w:sz w:val="20"/>
+                <w:szCs w:val="20"/>
+              </w:rPr>
+            </w:pPr>
+            <w:r>
+              <w:rPr>
+                <w:rFonts w:ascii="Arial" w:cs="Arial" w:eastAsia="Arial" w:hAnsi="Arial"/>
+                <w:color w:val="64748B"/>
+                <w:sz w:val="20"/>
+                <w:szCs w:val="20"/>
+              </w:rPr>
+              <w:t xml:space="preserve">Salary negotiation</w:t>
+            </w:r>
+          </w:p>
+          <w:p>
+            <w:pPr>
+              <w:spacing w:after="120"/>
+              <w:rPr>
+                <w:sz w:val="20"/>
+                <w:szCs w:val="20"/>
+              </w:rPr>
+            </w:pPr>
+            <w:r>
+              <w:rPr>
+                <w:rFonts w:ascii="Arial" w:cs="Arial" w:eastAsia="Arial" w:hAnsi="Arial"/>
+                <w:color w:val="64748B"/>
+                <w:sz w:val="20"/>
+                <w:szCs w:val="20"/>
+              </w:rPr>
+              <w:t xml:space="preserve">AI chatbot</w:t>
             </w:r>
           </w:p>
           <w:p>
@@ -7326,7 +8212,7 @@
         <w:sz w:val="18"/>
         <w:szCs w:val="18"/>
       </w:rPr>
-      <w:t xml:space="preserve">| Product Features Document</w:t>
+      <w:t xml:space="preserve">| Product Features Document v3.0</w:t>
     </w:r>
   </w:p>
 </w:hdr>
@@ -7424,18 +8310,6 @@
       <w:start w:val="1"/>
       <w:numFmt w:val="bullet"/>
       <w:lvlText w:val="•"/>
-      <w:lvlJc w:val="left"/>
-      <w:pPr>
-        <w:ind w:left="720" w:hanging="360"/>
-      </w:pPr>
-    </w:lvl>
-  </w:abstractNum>
-  <w:abstractNum w:abstractNumId="3" w15:restartNumberingAfterBreak="0">
-    <w:multiLevelType w:val="hybridMultilevel"/>
-    <w:lvl w:ilvl="0" w15:tentative="1">
-      <w:start w:val="1"/>
-      <w:numFmt w:val="decimal"/>
-      <w:lvlText w:val="%1."/>
       <w:lvlJc w:val="left"/>
       <w:pPr>
         <w:ind w:left="720" w:hanging="360"/>

</xml_diff>